<commit_message>
Improve bundled documentation viewing
</commit_message>
<xml_diff>
--- a/docs/v2/output/Celestial_Navigation_Manual_v2.docx
+++ b/docs/v2/output/Celestial_Navigation_Manual_v2.docx
@@ -292,7 +292,7 @@
     </w:p>
     <w:tbl>
       <w:tblPr>
-        <w:tblW w:w="11339" w:type="dxa"/>
+        <w:tblW w:w="13080" w:type="dxa"/>
         <w:jc w:val="start"/>
         <w:tblInd w:w="0" w:type="dxa"/>
         <w:tblLayout w:type="fixed"/>
@@ -304,14 +304,14 @@
         </w:tblCellMar>
       </w:tblPr>
       <w:tblGrid>
-        <w:gridCol w:w="1082"/>
-        <w:gridCol w:w="10257"/>
+        <w:gridCol w:w="1123"/>
+        <w:gridCol w:w="11957"/>
       </w:tblGrid>
       <w:tr>
         <w:trPr/>
         <w:tc>
           <w:tcPr>
-            <w:tcW w:w="1082" w:type="dxa"/>
+            <w:tcW w:w="1123" w:type="dxa"/>
             <w:tcBorders/>
             <w:vAlign w:val="center"/>
           </w:tcPr>
@@ -333,7 +333,7 @@
         </w:tc>
         <w:tc>
           <w:tcPr>
-            <w:tcW w:w="10257" w:type="dxa"/>
+            <w:tcW w:w="11957" w:type="dxa"/>
             <w:tcBorders/>
             <w:vAlign w:val="center"/>
           </w:tcPr>
@@ -358,7 +358,7 @@
         <w:trPr/>
         <w:tc>
           <w:tcPr>
-            <w:tcW w:w="1082" w:type="dxa"/>
+            <w:tcW w:w="1123" w:type="dxa"/>
             <w:tcBorders/>
             <w:vAlign w:val="center"/>
           </w:tcPr>
@@ -377,7 +377,7 @@
         </w:tc>
         <w:tc>
           <w:tcPr>
-            <w:tcW w:w="10257" w:type="dxa"/>
+            <w:tcW w:w="11957" w:type="dxa"/>
             <w:tcBorders/>
             <w:vAlign w:val="center"/>
           </w:tcPr>
@@ -399,7 +399,7 @@
         <w:trPr/>
         <w:tc>
           <w:tcPr>
-            <w:tcW w:w="1082" w:type="dxa"/>
+            <w:tcW w:w="1123" w:type="dxa"/>
             <w:tcBorders/>
             <w:vAlign w:val="center"/>
           </w:tcPr>
@@ -418,7 +418,7 @@
         </w:tc>
         <w:tc>
           <w:tcPr>
-            <w:tcW w:w="10257" w:type="dxa"/>
+            <w:tcW w:w="11957" w:type="dxa"/>
             <w:tcBorders/>
             <w:vAlign w:val="center"/>
           </w:tcPr>
@@ -440,7 +440,7 @@
         <w:trPr/>
         <w:tc>
           <w:tcPr>
-            <w:tcW w:w="1082" w:type="dxa"/>
+            <w:tcW w:w="1123" w:type="dxa"/>
             <w:tcBorders/>
             <w:vAlign w:val="center"/>
           </w:tcPr>
@@ -459,7 +459,7 @@
         </w:tc>
         <w:tc>
           <w:tcPr>
-            <w:tcW w:w="10257" w:type="dxa"/>
+            <w:tcW w:w="11957" w:type="dxa"/>
             <w:tcBorders/>
             <w:vAlign w:val="center"/>
           </w:tcPr>
@@ -481,7 +481,7 @@
         <w:trPr/>
         <w:tc>
           <w:tcPr>
-            <w:tcW w:w="1082" w:type="dxa"/>
+            <w:tcW w:w="1123" w:type="dxa"/>
             <w:tcBorders/>
             <w:vAlign w:val="center"/>
           </w:tcPr>
@@ -500,7 +500,7 @@
         </w:tc>
         <w:tc>
           <w:tcPr>
-            <w:tcW w:w="10257" w:type="dxa"/>
+            <w:tcW w:w="11957" w:type="dxa"/>
             <w:tcBorders/>
             <w:vAlign w:val="center"/>
           </w:tcPr>
@@ -522,7 +522,7 @@
         <w:trPr/>
         <w:tc>
           <w:tcPr>
-            <w:tcW w:w="1082" w:type="dxa"/>
+            <w:tcW w:w="1123" w:type="dxa"/>
             <w:tcBorders/>
             <w:vAlign w:val="center"/>
           </w:tcPr>
@@ -541,7 +541,7 @@
         </w:tc>
         <w:tc>
           <w:tcPr>
-            <w:tcW w:w="10257" w:type="dxa"/>
+            <w:tcW w:w="11957" w:type="dxa"/>
             <w:tcBorders/>
             <w:vAlign w:val="center"/>
           </w:tcPr>
@@ -563,7 +563,7 @@
         <w:trPr/>
         <w:tc>
           <w:tcPr>
-            <w:tcW w:w="1082" w:type="dxa"/>
+            <w:tcW w:w="1123" w:type="dxa"/>
             <w:tcBorders/>
             <w:vAlign w:val="center"/>
           </w:tcPr>
@@ -582,7 +582,7 @@
         </w:tc>
         <w:tc>
           <w:tcPr>
-            <w:tcW w:w="10257" w:type="dxa"/>
+            <w:tcW w:w="11957" w:type="dxa"/>
             <w:tcBorders/>
             <w:vAlign w:val="center"/>
           </w:tcPr>
@@ -604,7 +604,7 @@
         <w:trPr/>
         <w:tc>
           <w:tcPr>
-            <w:tcW w:w="1082" w:type="dxa"/>
+            <w:tcW w:w="1123" w:type="dxa"/>
             <w:tcBorders/>
             <w:vAlign w:val="center"/>
           </w:tcPr>
@@ -623,7 +623,7 @@
         </w:tc>
         <w:tc>
           <w:tcPr>
-            <w:tcW w:w="10257" w:type="dxa"/>
+            <w:tcW w:w="11957" w:type="dxa"/>
             <w:tcBorders/>
             <w:vAlign w:val="center"/>
           </w:tcPr>
@@ -645,7 +645,7 @@
         <w:trPr/>
         <w:tc>
           <w:tcPr>
-            <w:tcW w:w="1082" w:type="dxa"/>
+            <w:tcW w:w="1123" w:type="dxa"/>
             <w:tcBorders/>
             <w:vAlign w:val="center"/>
           </w:tcPr>
@@ -664,7 +664,7 @@
         </w:tc>
         <w:tc>
           <w:tcPr>
-            <w:tcW w:w="10257" w:type="dxa"/>
+            <w:tcW w:w="11957" w:type="dxa"/>
             <w:tcBorders/>
             <w:vAlign w:val="center"/>
           </w:tcPr>
@@ -686,7 +686,7 @@
         <w:trPr/>
         <w:tc>
           <w:tcPr>
-            <w:tcW w:w="1082" w:type="dxa"/>
+            <w:tcW w:w="1123" w:type="dxa"/>
             <w:tcBorders/>
             <w:vAlign w:val="center"/>
           </w:tcPr>
@@ -705,7 +705,7 @@
         </w:tc>
         <w:tc>
           <w:tcPr>
-            <w:tcW w:w="10257" w:type="dxa"/>
+            <w:tcW w:w="11957" w:type="dxa"/>
             <w:tcBorders/>
             <w:vAlign w:val="center"/>
           </w:tcPr>
@@ -727,7 +727,7 @@
         <w:trPr/>
         <w:tc>
           <w:tcPr>
-            <w:tcW w:w="1082" w:type="dxa"/>
+            <w:tcW w:w="1123" w:type="dxa"/>
             <w:tcBorders/>
             <w:vAlign w:val="center"/>
           </w:tcPr>
@@ -746,7 +746,7 @@
         </w:tc>
         <w:tc>
           <w:tcPr>
-            <w:tcW w:w="10257" w:type="dxa"/>
+            <w:tcW w:w="11957" w:type="dxa"/>
             <w:tcBorders/>
             <w:vAlign w:val="center"/>
           </w:tcPr>
@@ -768,7 +768,7 @@
         <w:trPr/>
         <w:tc>
           <w:tcPr>
-            <w:tcW w:w="1082" w:type="dxa"/>
+            <w:tcW w:w="1123" w:type="dxa"/>
             <w:tcBorders/>
             <w:vAlign w:val="center"/>
           </w:tcPr>
@@ -787,7 +787,7 @@
         </w:tc>
         <w:tc>
           <w:tcPr>
-            <w:tcW w:w="10257" w:type="dxa"/>
+            <w:tcW w:w="11957" w:type="dxa"/>
             <w:tcBorders/>
             <w:vAlign w:val="center"/>
           </w:tcPr>
@@ -809,7 +809,7 @@
         <w:trPr/>
         <w:tc>
           <w:tcPr>
-            <w:tcW w:w="1082" w:type="dxa"/>
+            <w:tcW w:w="1123" w:type="dxa"/>
             <w:tcBorders/>
             <w:vAlign w:val="center"/>
           </w:tcPr>
@@ -828,7 +828,7 @@
         </w:tc>
         <w:tc>
           <w:tcPr>
-            <w:tcW w:w="10257" w:type="dxa"/>
+            <w:tcW w:w="11957" w:type="dxa"/>
             <w:tcBorders/>
             <w:vAlign w:val="center"/>
           </w:tcPr>
@@ -850,7 +850,7 @@
         <w:trPr/>
         <w:tc>
           <w:tcPr>
-            <w:tcW w:w="1082" w:type="dxa"/>
+            <w:tcW w:w="1123" w:type="dxa"/>
             <w:tcBorders/>
             <w:vAlign w:val="center"/>
           </w:tcPr>
@@ -869,7 +869,7 @@
         </w:tc>
         <w:tc>
           <w:tcPr>
-            <w:tcW w:w="10257" w:type="dxa"/>
+            <w:tcW w:w="11957" w:type="dxa"/>
             <w:tcBorders/>
             <w:vAlign w:val="center"/>
           </w:tcPr>
@@ -2311,7 +2311,7 @@
     </w:p>
     <w:tbl>
       <w:tblPr>
-        <w:tblW w:w="11339" w:type="dxa"/>
+        <w:tblW w:w="13596" w:type="dxa"/>
         <w:jc w:val="start"/>
         <w:tblInd w:w="0" w:type="dxa"/>
         <w:tblLayout w:type="fixed"/>
@@ -2323,14 +2323,14 @@
         </w:tblCellMar>
       </w:tblPr>
       <w:tblGrid>
-        <w:gridCol w:w="1747"/>
-        <w:gridCol w:w="9592"/>
+        <w:gridCol w:w="1835"/>
+        <w:gridCol w:w="11761"/>
       </w:tblGrid>
       <w:tr>
         <w:trPr/>
         <w:tc>
           <w:tcPr>
-            <w:tcW w:w="1747" w:type="dxa"/>
+            <w:tcW w:w="1835" w:type="dxa"/>
             <w:tcBorders/>
             <w:vAlign w:val="center"/>
           </w:tcPr>
@@ -2352,7 +2352,7 @@
         </w:tc>
         <w:tc>
           <w:tcPr>
-            <w:tcW w:w="9592" w:type="dxa"/>
+            <w:tcW w:w="11761" w:type="dxa"/>
             <w:tcBorders/>
             <w:vAlign w:val="center"/>
           </w:tcPr>
@@ -2377,7 +2377,7 @@
         <w:trPr/>
         <w:tc>
           <w:tcPr>
-            <w:tcW w:w="1747" w:type="dxa"/>
+            <w:tcW w:w="1835" w:type="dxa"/>
             <w:tcBorders/>
             <w:vAlign w:val="center"/>
           </w:tcPr>
@@ -2396,7 +2396,7 @@
         </w:tc>
         <w:tc>
           <w:tcPr>
-            <w:tcW w:w="9592" w:type="dxa"/>
+            <w:tcW w:w="11761" w:type="dxa"/>
             <w:tcBorders/>
             <w:vAlign w:val="center"/>
           </w:tcPr>
@@ -2418,7 +2418,7 @@
         <w:trPr/>
         <w:tc>
           <w:tcPr>
-            <w:tcW w:w="1747" w:type="dxa"/>
+            <w:tcW w:w="1835" w:type="dxa"/>
             <w:tcBorders/>
             <w:vAlign w:val="center"/>
           </w:tcPr>
@@ -2437,7 +2437,7 @@
         </w:tc>
         <w:tc>
           <w:tcPr>
-            <w:tcW w:w="9592" w:type="dxa"/>
+            <w:tcW w:w="11761" w:type="dxa"/>
             <w:tcBorders/>
             <w:vAlign w:val="center"/>
           </w:tcPr>
@@ -2459,7 +2459,7 @@
         <w:trPr/>
         <w:tc>
           <w:tcPr>
-            <w:tcW w:w="1747" w:type="dxa"/>
+            <w:tcW w:w="1835" w:type="dxa"/>
             <w:tcBorders/>
             <w:vAlign w:val="center"/>
           </w:tcPr>
@@ -2478,7 +2478,7 @@
         </w:tc>
         <w:tc>
           <w:tcPr>
-            <w:tcW w:w="9592" w:type="dxa"/>
+            <w:tcW w:w="11761" w:type="dxa"/>
             <w:tcBorders/>
             <w:vAlign w:val="center"/>
           </w:tcPr>
@@ -2500,7 +2500,7 @@
         <w:trPr/>
         <w:tc>
           <w:tcPr>
-            <w:tcW w:w="1747" w:type="dxa"/>
+            <w:tcW w:w="1835" w:type="dxa"/>
             <w:tcBorders/>
             <w:vAlign w:val="center"/>
           </w:tcPr>
@@ -2519,7 +2519,7 @@
         </w:tc>
         <w:tc>
           <w:tcPr>
-            <w:tcW w:w="9592" w:type="dxa"/>
+            <w:tcW w:w="11761" w:type="dxa"/>
             <w:tcBorders/>
             <w:vAlign w:val="center"/>
           </w:tcPr>
@@ -2541,7 +2541,7 @@
         <w:trPr/>
         <w:tc>
           <w:tcPr>
-            <w:tcW w:w="1747" w:type="dxa"/>
+            <w:tcW w:w="1835" w:type="dxa"/>
             <w:tcBorders/>
             <w:vAlign w:val="center"/>
           </w:tcPr>
@@ -2560,7 +2560,7 @@
         </w:tc>
         <w:tc>
           <w:tcPr>
-            <w:tcW w:w="9592" w:type="dxa"/>
+            <w:tcW w:w="11761" w:type="dxa"/>
             <w:tcBorders/>
             <w:vAlign w:val="center"/>
           </w:tcPr>
@@ -3020,7 +3020,7 @@
     </w:p>
     <w:tbl>
       <w:tblPr>
-        <w:tblW w:w="11339" w:type="dxa"/>
+        <w:tblW w:w="16251" w:type="dxa"/>
         <w:jc w:val="start"/>
         <w:tblInd w:w="0" w:type="dxa"/>
         <w:tblLayout w:type="fixed"/>
@@ -3032,14 +3032,14 @@
         </w:tblCellMar>
       </w:tblPr>
       <w:tblGrid>
-        <w:gridCol w:w="2124"/>
-        <w:gridCol w:w="9215"/>
+        <w:gridCol w:w="2313"/>
+        <w:gridCol w:w="13938"/>
       </w:tblGrid>
       <w:tr>
         <w:trPr/>
         <w:tc>
           <w:tcPr>
-            <w:tcW w:w="2124" w:type="dxa"/>
+            <w:tcW w:w="2313" w:type="dxa"/>
             <w:tcBorders/>
             <w:vAlign w:val="center"/>
           </w:tcPr>
@@ -3061,7 +3061,7 @@
         </w:tc>
         <w:tc>
           <w:tcPr>
-            <w:tcW w:w="9215" w:type="dxa"/>
+            <w:tcW w:w="13938" w:type="dxa"/>
             <w:tcBorders/>
             <w:vAlign w:val="center"/>
           </w:tcPr>
@@ -3086,7 +3086,7 @@
         <w:trPr/>
         <w:tc>
           <w:tcPr>
-            <w:tcW w:w="2124" w:type="dxa"/>
+            <w:tcW w:w="2313" w:type="dxa"/>
             <w:tcBorders/>
             <w:vAlign w:val="center"/>
           </w:tcPr>
@@ -3105,7 +3105,7 @@
         </w:tc>
         <w:tc>
           <w:tcPr>
-            <w:tcW w:w="9215" w:type="dxa"/>
+            <w:tcW w:w="13938" w:type="dxa"/>
             <w:tcBorders/>
             <w:vAlign w:val="center"/>
           </w:tcPr>
@@ -3127,7 +3127,7 @@
         <w:trPr/>
         <w:tc>
           <w:tcPr>
-            <w:tcW w:w="2124" w:type="dxa"/>
+            <w:tcW w:w="2313" w:type="dxa"/>
             <w:tcBorders/>
             <w:vAlign w:val="center"/>
           </w:tcPr>
@@ -3146,7 +3146,7 @@
         </w:tc>
         <w:tc>
           <w:tcPr>
-            <w:tcW w:w="9215" w:type="dxa"/>
+            <w:tcW w:w="13938" w:type="dxa"/>
             <w:tcBorders/>
             <w:vAlign w:val="center"/>
           </w:tcPr>
@@ -3168,7 +3168,7 @@
         <w:trPr/>
         <w:tc>
           <w:tcPr>
-            <w:tcW w:w="2124" w:type="dxa"/>
+            <w:tcW w:w="2313" w:type="dxa"/>
             <w:tcBorders/>
             <w:vAlign w:val="center"/>
           </w:tcPr>
@@ -3187,7 +3187,7 @@
         </w:tc>
         <w:tc>
           <w:tcPr>
-            <w:tcW w:w="9215" w:type="dxa"/>
+            <w:tcW w:w="13938" w:type="dxa"/>
             <w:tcBorders/>
             <w:vAlign w:val="center"/>
           </w:tcPr>
@@ -3209,7 +3209,7 @@
         <w:trPr/>
         <w:tc>
           <w:tcPr>
-            <w:tcW w:w="2124" w:type="dxa"/>
+            <w:tcW w:w="2313" w:type="dxa"/>
             <w:tcBorders/>
             <w:vAlign w:val="center"/>
           </w:tcPr>
@@ -3228,7 +3228,7 @@
         </w:tc>
         <w:tc>
           <w:tcPr>
-            <w:tcW w:w="9215" w:type="dxa"/>
+            <w:tcW w:w="13938" w:type="dxa"/>
             <w:tcBorders/>
             <w:vAlign w:val="center"/>
           </w:tcPr>
@@ -3250,7 +3250,7 @@
         <w:trPr/>
         <w:tc>
           <w:tcPr>
-            <w:tcW w:w="2124" w:type="dxa"/>
+            <w:tcW w:w="2313" w:type="dxa"/>
             <w:tcBorders/>
             <w:vAlign w:val="center"/>
           </w:tcPr>
@@ -3269,7 +3269,7 @@
         </w:tc>
         <w:tc>
           <w:tcPr>
-            <w:tcW w:w="9215" w:type="dxa"/>
+            <w:tcW w:w="13938" w:type="dxa"/>
             <w:tcBorders/>
             <w:vAlign w:val="center"/>
           </w:tcPr>
@@ -3291,7 +3291,7 @@
         <w:trPr/>
         <w:tc>
           <w:tcPr>
-            <w:tcW w:w="2124" w:type="dxa"/>
+            <w:tcW w:w="2313" w:type="dxa"/>
             <w:tcBorders/>
             <w:vAlign w:val="center"/>
           </w:tcPr>
@@ -3310,7 +3310,7 @@
         </w:tc>
         <w:tc>
           <w:tcPr>
-            <w:tcW w:w="9215" w:type="dxa"/>
+            <w:tcW w:w="13938" w:type="dxa"/>
             <w:tcBorders/>
             <w:vAlign w:val="center"/>
           </w:tcPr>
@@ -3332,7 +3332,7 @@
         <w:trPr/>
         <w:tc>
           <w:tcPr>
-            <w:tcW w:w="2124" w:type="dxa"/>
+            <w:tcW w:w="2313" w:type="dxa"/>
             <w:tcBorders/>
             <w:vAlign w:val="center"/>
           </w:tcPr>
@@ -3351,7 +3351,7 @@
         </w:tc>
         <w:tc>
           <w:tcPr>
-            <w:tcW w:w="9215" w:type="dxa"/>
+            <w:tcW w:w="13938" w:type="dxa"/>
             <w:tcBorders/>
             <w:vAlign w:val="center"/>
           </w:tcPr>
@@ -3373,7 +3373,7 @@
         <w:trPr/>
         <w:tc>
           <w:tcPr>
-            <w:tcW w:w="2124" w:type="dxa"/>
+            <w:tcW w:w="2313" w:type="dxa"/>
             <w:tcBorders/>
             <w:vAlign w:val="center"/>
           </w:tcPr>
@@ -3392,7 +3392,7 @@
         </w:tc>
         <w:tc>
           <w:tcPr>
-            <w:tcW w:w="9215" w:type="dxa"/>
+            <w:tcW w:w="13938" w:type="dxa"/>
             <w:tcBorders/>
             <w:vAlign w:val="center"/>
           </w:tcPr>
@@ -3414,7 +3414,7 @@
         <w:trPr/>
         <w:tc>
           <w:tcPr>
-            <w:tcW w:w="2124" w:type="dxa"/>
+            <w:tcW w:w="2313" w:type="dxa"/>
             <w:tcBorders/>
             <w:vAlign w:val="center"/>
           </w:tcPr>
@@ -3433,7 +3433,7 @@
         </w:tc>
         <w:tc>
           <w:tcPr>
-            <w:tcW w:w="9215" w:type="dxa"/>
+            <w:tcW w:w="13938" w:type="dxa"/>
             <w:tcBorders/>
             <w:vAlign w:val="center"/>
           </w:tcPr>
@@ -3455,7 +3455,7 @@
         <w:trPr/>
         <w:tc>
           <w:tcPr>
-            <w:tcW w:w="2124" w:type="dxa"/>
+            <w:tcW w:w="2313" w:type="dxa"/>
             <w:tcBorders/>
             <w:vAlign w:val="center"/>
           </w:tcPr>
@@ -3474,7 +3474,7 @@
         </w:tc>
         <w:tc>
           <w:tcPr>
-            <w:tcW w:w="9215" w:type="dxa"/>
+            <w:tcW w:w="13938" w:type="dxa"/>
             <w:tcBorders/>
             <w:vAlign w:val="center"/>
           </w:tcPr>
@@ -3496,7 +3496,7 @@
         <w:trPr/>
         <w:tc>
           <w:tcPr>
-            <w:tcW w:w="2124" w:type="dxa"/>
+            <w:tcW w:w="2313" w:type="dxa"/>
             <w:tcBorders/>
             <w:vAlign w:val="center"/>
           </w:tcPr>
@@ -3515,7 +3515,7 @@
         </w:tc>
         <w:tc>
           <w:tcPr>
-            <w:tcW w:w="9215" w:type="dxa"/>
+            <w:tcW w:w="13938" w:type="dxa"/>
             <w:tcBorders/>
             <w:vAlign w:val="center"/>
           </w:tcPr>
@@ -3537,7 +3537,7 @@
         <w:trPr/>
         <w:tc>
           <w:tcPr>
-            <w:tcW w:w="2124" w:type="dxa"/>
+            <w:tcW w:w="2313" w:type="dxa"/>
             <w:tcBorders/>
             <w:vAlign w:val="center"/>
           </w:tcPr>
@@ -3556,7 +3556,7 @@
         </w:tc>
         <w:tc>
           <w:tcPr>
-            <w:tcW w:w="9215" w:type="dxa"/>
+            <w:tcW w:w="13938" w:type="dxa"/>
             <w:tcBorders/>
             <w:vAlign w:val="center"/>
           </w:tcPr>
@@ -3578,7 +3578,7 @@
         <w:trPr/>
         <w:tc>
           <w:tcPr>
-            <w:tcW w:w="2124" w:type="dxa"/>
+            <w:tcW w:w="2313" w:type="dxa"/>
             <w:tcBorders/>
             <w:vAlign w:val="center"/>
           </w:tcPr>
@@ -3597,20 +3597,61 @@
         </w:tc>
         <w:tc>
           <w:tcPr>
-            <w:tcW w:w="9215" w:type="dxa"/>
-            <w:tcBorders/>
-            <w:vAlign w:val="center"/>
-          </w:tcPr>
-          <w:p>
-            <w:pPr>
-              <w:pStyle w:val="TableContents"/>
-              <w:bidi w:val="0"/>
-              <w:spacing w:before="0" w:after="283"/>
-              <w:rPr/>
-            </w:pPr>
-            <w:r>
-              <w:rPr/>
-              <w:t>Open this completely offline manual.</w:t>
+            <w:tcW w:w="13938" w:type="dxa"/>
+            <w:tcBorders/>
+            <w:vAlign w:val="center"/>
+          </w:tcPr>
+          <w:p>
+            <w:pPr>
+              <w:pStyle w:val="TableContents"/>
+              <w:bidi w:val="0"/>
+              <w:spacing w:before="0" w:after="283"/>
+              <w:rPr/>
+            </w:pPr>
+            <w:r>
+              <w:rPr/>
+              <w:t>Open this completely offline manual in the plugin's internal viewer.</w:t>
+            </w:r>
+          </w:p>
+        </w:tc>
+      </w:tr>
+      <w:tr>
+        <w:trPr/>
+        <w:tc>
+          <w:tcPr>
+            <w:tcW w:w="2313" w:type="dxa"/>
+            <w:tcBorders/>
+            <w:vAlign w:val="center"/>
+          </w:tcPr>
+          <w:p>
+            <w:pPr>
+              <w:pStyle w:val="TableContents"/>
+              <w:bidi w:val="0"/>
+              <w:spacing w:before="0" w:after="283"/>
+              <w:rPr/>
+            </w:pPr>
+            <w:r>
+              <w:rPr/>
+              <w:t>PDF Documentation</w:t>
+            </w:r>
+          </w:p>
+        </w:tc>
+        <w:tc>
+          <w:tcPr>
+            <w:tcW w:w="13938" w:type="dxa"/>
+            <w:tcBorders/>
+            <w:vAlign w:val="center"/>
+          </w:tcPr>
+          <w:p>
+            <w:pPr>
+              <w:pStyle w:val="TableContents"/>
+              <w:bidi w:val="0"/>
+              <w:spacing w:before="0" w:after="283"/>
+              <w:rPr/>
+            </w:pPr>
+            <w:r>
+              <w:rPr/>
+              <w:t>Open the fixed-layout manual in the system PDF viewer. If no external viewer is available, the plugin safely opens the internal HTML manual instead.</w:t>
             </w:r>
           </w:p>
         </w:tc>
@@ -7855,7 +7896,7 @@
     </w:p>
     <w:tbl>
       <w:tblPr>
-        <w:tblW w:w="11339" w:type="dxa"/>
+        <w:tblW w:w="12160" w:type="dxa"/>
         <w:jc w:val="start"/>
         <w:tblInd w:w="0" w:type="dxa"/>
         <w:tblLayout w:type="fixed"/>
@@ -7867,14 +7908,14 @@
         </w:tblCellMar>
       </w:tblPr>
       <w:tblGrid>
-        <w:gridCol w:w="1657"/>
-        <w:gridCol w:w="9682"/>
+        <w:gridCol w:w="1684"/>
+        <w:gridCol w:w="10476"/>
       </w:tblGrid>
       <w:tr>
         <w:trPr/>
         <w:tc>
           <w:tcPr>
-            <w:tcW w:w="1657" w:type="dxa"/>
+            <w:tcW w:w="1684" w:type="dxa"/>
             <w:tcBorders/>
             <w:vAlign w:val="center"/>
           </w:tcPr>
@@ -7896,7 +7937,7 @@
         </w:tc>
         <w:tc>
           <w:tcPr>
-            <w:tcW w:w="9682" w:type="dxa"/>
+            <w:tcW w:w="10476" w:type="dxa"/>
             <w:tcBorders/>
             <w:vAlign w:val="center"/>
           </w:tcPr>
@@ -7921,7 +7962,7 @@
         <w:trPr/>
         <w:tc>
           <w:tcPr>
-            <w:tcW w:w="1657" w:type="dxa"/>
+            <w:tcW w:w="1684" w:type="dxa"/>
             <w:tcBorders/>
             <w:vAlign w:val="center"/>
           </w:tcPr>
@@ -7940,7 +7981,7 @@
         </w:tc>
         <w:tc>
           <w:tcPr>
-            <w:tcW w:w="9682" w:type="dxa"/>
+            <w:tcW w:w="10476" w:type="dxa"/>
             <w:tcBorders/>
             <w:vAlign w:val="center"/>
           </w:tcPr>
@@ -7962,7 +8003,7 @@
         <w:trPr/>
         <w:tc>
           <w:tcPr>
-            <w:tcW w:w="1657" w:type="dxa"/>
+            <w:tcW w:w="1684" w:type="dxa"/>
             <w:tcBorders/>
             <w:vAlign w:val="center"/>
           </w:tcPr>
@@ -7981,7 +8022,7 @@
         </w:tc>
         <w:tc>
           <w:tcPr>
-            <w:tcW w:w="9682" w:type="dxa"/>
+            <w:tcW w:w="10476" w:type="dxa"/>
             <w:tcBorders/>
             <w:vAlign w:val="center"/>
           </w:tcPr>
@@ -8003,7 +8044,7 @@
         <w:trPr/>
         <w:tc>
           <w:tcPr>
-            <w:tcW w:w="1657" w:type="dxa"/>
+            <w:tcW w:w="1684" w:type="dxa"/>
             <w:tcBorders/>
             <w:vAlign w:val="center"/>
           </w:tcPr>
@@ -8022,7 +8063,7 @@
         </w:tc>
         <w:tc>
           <w:tcPr>
-            <w:tcW w:w="9682" w:type="dxa"/>
+            <w:tcW w:w="10476" w:type="dxa"/>
             <w:tcBorders/>
             <w:vAlign w:val="center"/>
           </w:tcPr>
@@ -8044,7 +8085,7 @@
         <w:trPr/>
         <w:tc>
           <w:tcPr>
-            <w:tcW w:w="1657" w:type="dxa"/>
+            <w:tcW w:w="1684" w:type="dxa"/>
             <w:tcBorders/>
             <w:vAlign w:val="center"/>
           </w:tcPr>
@@ -8063,7 +8104,7 @@
         </w:tc>
         <w:tc>
           <w:tcPr>
-            <w:tcW w:w="9682" w:type="dxa"/>
+            <w:tcW w:w="10476" w:type="dxa"/>
             <w:tcBorders/>
             <w:vAlign w:val="center"/>
           </w:tcPr>
@@ -8085,7 +8126,7 @@
         <w:trPr/>
         <w:tc>
           <w:tcPr>
-            <w:tcW w:w="1657" w:type="dxa"/>
+            <w:tcW w:w="1684" w:type="dxa"/>
             <w:tcBorders/>
             <w:vAlign w:val="center"/>
           </w:tcPr>
@@ -8104,7 +8145,7 @@
         </w:tc>
         <w:tc>
           <w:tcPr>
-            <w:tcW w:w="9682" w:type="dxa"/>
+            <w:tcW w:w="10476" w:type="dxa"/>
             <w:tcBorders/>
             <w:vAlign w:val="center"/>
           </w:tcPr>
@@ -8126,7 +8167,7 @@
         <w:trPr/>
         <w:tc>
           <w:tcPr>
-            <w:tcW w:w="1657" w:type="dxa"/>
+            <w:tcW w:w="1684" w:type="dxa"/>
             <w:tcBorders/>
             <w:vAlign w:val="center"/>
           </w:tcPr>
@@ -8145,7 +8186,7 @@
         </w:tc>
         <w:tc>
           <w:tcPr>
-            <w:tcW w:w="9682" w:type="dxa"/>
+            <w:tcW w:w="10476" w:type="dxa"/>
             <w:tcBorders/>
             <w:vAlign w:val="center"/>
           </w:tcPr>
@@ -8167,7 +8208,7 @@
         <w:trPr/>
         <w:tc>
           <w:tcPr>
-            <w:tcW w:w="1657" w:type="dxa"/>
+            <w:tcW w:w="1684" w:type="dxa"/>
             <w:tcBorders/>
             <w:vAlign w:val="center"/>
           </w:tcPr>
@@ -8186,7 +8227,7 @@
         </w:tc>
         <w:tc>
           <w:tcPr>
-            <w:tcW w:w="9682" w:type="dxa"/>
+            <w:tcW w:w="10476" w:type="dxa"/>
             <w:tcBorders/>
             <w:vAlign w:val="center"/>
           </w:tcPr>
@@ -8208,7 +8249,7 @@
         <w:trPr/>
         <w:tc>
           <w:tcPr>
-            <w:tcW w:w="1657" w:type="dxa"/>
+            <w:tcW w:w="1684" w:type="dxa"/>
             <w:tcBorders/>
             <w:vAlign w:val="center"/>
           </w:tcPr>
@@ -8227,7 +8268,7 @@
         </w:tc>
         <w:tc>
           <w:tcPr>
-            <w:tcW w:w="9682" w:type="dxa"/>
+            <w:tcW w:w="10476" w:type="dxa"/>
             <w:tcBorders/>
             <w:vAlign w:val="center"/>
           </w:tcPr>
@@ -8249,7 +8290,7 @@
         <w:trPr/>
         <w:tc>
           <w:tcPr>
-            <w:tcW w:w="1657" w:type="dxa"/>
+            <w:tcW w:w="1684" w:type="dxa"/>
             <w:tcBorders/>
             <w:vAlign w:val="center"/>
           </w:tcPr>
@@ -8268,7 +8309,7 @@
         </w:tc>
         <w:tc>
           <w:tcPr>
-            <w:tcW w:w="9682" w:type="dxa"/>
+            <w:tcW w:w="10476" w:type="dxa"/>
             <w:tcBorders/>
             <w:vAlign w:val="center"/>
           </w:tcPr>
@@ -8290,7 +8331,7 @@
         <w:trPr/>
         <w:tc>
           <w:tcPr>
-            <w:tcW w:w="1657" w:type="dxa"/>
+            <w:tcW w:w="1684" w:type="dxa"/>
             <w:tcBorders/>
             <w:vAlign w:val="center"/>
           </w:tcPr>
@@ -8309,7 +8350,7 @@
         </w:tc>
         <w:tc>
           <w:tcPr>
-            <w:tcW w:w="9682" w:type="dxa"/>
+            <w:tcW w:w="10476" w:type="dxa"/>
             <w:tcBorders/>
             <w:vAlign w:val="center"/>
           </w:tcPr>
@@ -8331,7 +8372,7 @@
         <w:trPr/>
         <w:tc>
           <w:tcPr>
-            <w:tcW w:w="1657" w:type="dxa"/>
+            <w:tcW w:w="1684" w:type="dxa"/>
             <w:tcBorders/>
             <w:vAlign w:val="center"/>
           </w:tcPr>
@@ -8350,7 +8391,7 @@
         </w:tc>
         <w:tc>
           <w:tcPr>
-            <w:tcW w:w="9682" w:type="dxa"/>
+            <w:tcW w:w="10476" w:type="dxa"/>
             <w:tcBorders/>
             <w:vAlign w:val="center"/>
           </w:tcPr>
@@ -8372,7 +8413,7 @@
         <w:trPr/>
         <w:tc>
           <w:tcPr>
-            <w:tcW w:w="1657" w:type="dxa"/>
+            <w:tcW w:w="1684" w:type="dxa"/>
             <w:tcBorders/>
             <w:vAlign w:val="center"/>
           </w:tcPr>
@@ -8391,7 +8432,7 @@
         </w:tc>
         <w:tc>
           <w:tcPr>
-            <w:tcW w:w="9682" w:type="dxa"/>
+            <w:tcW w:w="10476" w:type="dxa"/>
             <w:tcBorders/>
             <w:vAlign w:val="center"/>
           </w:tcPr>
@@ -8413,7 +8454,7 @@
         <w:trPr/>
         <w:tc>
           <w:tcPr>
-            <w:tcW w:w="1657" w:type="dxa"/>
+            <w:tcW w:w="1684" w:type="dxa"/>
             <w:tcBorders/>
             <w:vAlign w:val="center"/>
           </w:tcPr>
@@ -8432,7 +8473,7 @@
         </w:tc>
         <w:tc>
           <w:tcPr>
-            <w:tcW w:w="9682" w:type="dxa"/>
+            <w:tcW w:w="10476" w:type="dxa"/>
             <w:tcBorders/>
             <w:vAlign w:val="center"/>
           </w:tcPr>
@@ -8454,7 +8495,7 @@
         <w:trPr/>
         <w:tc>
           <w:tcPr>
-            <w:tcW w:w="1657" w:type="dxa"/>
+            <w:tcW w:w="1684" w:type="dxa"/>
             <w:tcBorders/>
             <w:vAlign w:val="center"/>
           </w:tcPr>
@@ -8473,7 +8514,7 @@
         </w:tc>
         <w:tc>
           <w:tcPr>
-            <w:tcW w:w="9682" w:type="dxa"/>
+            <w:tcW w:w="10476" w:type="dxa"/>
             <w:tcBorders/>
             <w:vAlign w:val="center"/>
           </w:tcPr>
@@ -8495,7 +8536,7 @@
         <w:trPr/>
         <w:tc>
           <w:tcPr>
-            <w:tcW w:w="1657" w:type="dxa"/>
+            <w:tcW w:w="1684" w:type="dxa"/>
             <w:tcBorders/>
             <w:vAlign w:val="center"/>
           </w:tcPr>
@@ -8514,7 +8555,7 @@
         </w:tc>
         <w:tc>
           <w:tcPr>
-            <w:tcW w:w="9682" w:type="dxa"/>
+            <w:tcW w:w="10476" w:type="dxa"/>
             <w:tcBorders/>
             <w:vAlign w:val="center"/>
           </w:tcPr>
@@ -8536,7 +8577,7 @@
         <w:trPr/>
         <w:tc>
           <w:tcPr>
-            <w:tcW w:w="1657" w:type="dxa"/>
+            <w:tcW w:w="1684" w:type="dxa"/>
             <w:tcBorders/>
             <w:vAlign w:val="center"/>
           </w:tcPr>
@@ -8555,7 +8596,7 @@
         </w:tc>
         <w:tc>
           <w:tcPr>
-            <w:tcW w:w="9682" w:type="dxa"/>
+            <w:tcW w:w="10476" w:type="dxa"/>
             <w:tcBorders/>
             <w:vAlign w:val="center"/>
           </w:tcPr>
@@ -8577,7 +8618,7 @@
         <w:trPr/>
         <w:tc>
           <w:tcPr>
-            <w:tcW w:w="1657" w:type="dxa"/>
+            <w:tcW w:w="1684" w:type="dxa"/>
             <w:tcBorders/>
             <w:vAlign w:val="center"/>
           </w:tcPr>
@@ -8596,7 +8637,7 @@
         </w:tc>
         <w:tc>
           <w:tcPr>
-            <w:tcW w:w="9682" w:type="dxa"/>
+            <w:tcW w:w="10476" w:type="dxa"/>
             <w:tcBorders/>
             <w:vAlign w:val="center"/>
           </w:tcPr>
@@ -8618,7 +8659,7 @@
         <w:trPr/>
         <w:tc>
           <w:tcPr>
-            <w:tcW w:w="1657" w:type="dxa"/>
+            <w:tcW w:w="1684" w:type="dxa"/>
             <w:tcBorders/>
             <w:vAlign w:val="center"/>
           </w:tcPr>
@@ -8637,7 +8678,7 @@
         </w:tc>
         <w:tc>
           <w:tcPr>
-            <w:tcW w:w="9682" w:type="dxa"/>
+            <w:tcW w:w="10476" w:type="dxa"/>
             <w:tcBorders/>
             <w:vAlign w:val="center"/>
           </w:tcPr>
@@ -8659,7 +8700,7 @@
         <w:trPr/>
         <w:tc>
           <w:tcPr>
-            <w:tcW w:w="1657" w:type="dxa"/>
+            <w:tcW w:w="1684" w:type="dxa"/>
             <w:tcBorders/>
             <w:vAlign w:val="center"/>
           </w:tcPr>
@@ -8678,7 +8719,7 @@
         </w:tc>
         <w:tc>
           <w:tcPr>
-            <w:tcW w:w="9682" w:type="dxa"/>
+            <w:tcW w:w="10476" w:type="dxa"/>
             <w:tcBorders/>
             <w:vAlign w:val="center"/>
           </w:tcPr>
@@ -8700,7 +8741,7 @@
         <w:trPr/>
         <w:tc>
           <w:tcPr>
-            <w:tcW w:w="1657" w:type="dxa"/>
+            <w:tcW w:w="1684" w:type="dxa"/>
             <w:tcBorders/>
             <w:vAlign w:val="center"/>
           </w:tcPr>
@@ -8719,7 +8760,7 @@
         </w:tc>
         <w:tc>
           <w:tcPr>
-            <w:tcW w:w="9682" w:type="dxa"/>
+            <w:tcW w:w="10476" w:type="dxa"/>
             <w:tcBorders/>
             <w:vAlign w:val="center"/>
           </w:tcPr>
@@ -8741,7 +8782,7 @@
         <w:trPr/>
         <w:tc>
           <w:tcPr>
-            <w:tcW w:w="1657" w:type="dxa"/>
+            <w:tcW w:w="1684" w:type="dxa"/>
             <w:tcBorders/>
             <w:vAlign w:val="center"/>
           </w:tcPr>
@@ -8760,7 +8801,7 @@
         </w:tc>
         <w:tc>
           <w:tcPr>
-            <w:tcW w:w="9682" w:type="dxa"/>
+            <w:tcW w:w="10476" w:type="dxa"/>
             <w:tcBorders/>
             <w:vAlign w:val="center"/>
           </w:tcPr>
@@ -8782,7 +8823,7 @@
         <w:trPr/>
         <w:tc>
           <w:tcPr>
-            <w:tcW w:w="1657" w:type="dxa"/>
+            <w:tcW w:w="1684" w:type="dxa"/>
             <w:tcBorders/>
             <w:vAlign w:val="center"/>
           </w:tcPr>
@@ -8801,7 +8842,7 @@
         </w:tc>
         <w:tc>
           <w:tcPr>
-            <w:tcW w:w="9682" w:type="dxa"/>
+            <w:tcW w:w="10476" w:type="dxa"/>
             <w:tcBorders/>
             <w:vAlign w:val="center"/>
           </w:tcPr>
@@ -8823,7 +8864,7 @@
         <w:trPr/>
         <w:tc>
           <w:tcPr>
-            <w:tcW w:w="1657" w:type="dxa"/>
+            <w:tcW w:w="1684" w:type="dxa"/>
             <w:tcBorders/>
             <w:vAlign w:val="center"/>
           </w:tcPr>
@@ -8842,7 +8883,7 @@
         </w:tc>
         <w:tc>
           <w:tcPr>
-            <w:tcW w:w="9682" w:type="dxa"/>
+            <w:tcW w:w="10476" w:type="dxa"/>
             <w:tcBorders/>
             <w:vAlign w:val="center"/>
           </w:tcPr>
@@ -8864,7 +8905,7 @@
         <w:trPr/>
         <w:tc>
           <w:tcPr>
-            <w:tcW w:w="1657" w:type="dxa"/>
+            <w:tcW w:w="1684" w:type="dxa"/>
             <w:tcBorders/>
             <w:vAlign w:val="center"/>
           </w:tcPr>
@@ -8883,7 +8924,7 @@
         </w:tc>
         <w:tc>
           <w:tcPr>
-            <w:tcW w:w="9682" w:type="dxa"/>
+            <w:tcW w:w="10476" w:type="dxa"/>
             <w:tcBorders/>
             <w:vAlign w:val="center"/>
           </w:tcPr>
@@ -8905,7 +8946,7 @@
         <w:trPr/>
         <w:tc>
           <w:tcPr>
-            <w:tcW w:w="1657" w:type="dxa"/>
+            <w:tcW w:w="1684" w:type="dxa"/>
             <w:tcBorders/>
             <w:vAlign w:val="center"/>
           </w:tcPr>
@@ -8924,7 +8965,7 @@
         </w:tc>
         <w:tc>
           <w:tcPr>
-            <w:tcW w:w="9682" w:type="dxa"/>
+            <w:tcW w:w="10476" w:type="dxa"/>
             <w:tcBorders/>
             <w:vAlign w:val="center"/>
           </w:tcPr>
@@ -8946,7 +8987,7 @@
         <w:trPr/>
         <w:tc>
           <w:tcPr>
-            <w:tcW w:w="1657" w:type="dxa"/>
+            <w:tcW w:w="1684" w:type="dxa"/>
             <w:tcBorders/>
             <w:vAlign w:val="center"/>
           </w:tcPr>
@@ -8965,7 +9006,7 @@
         </w:tc>
         <w:tc>
           <w:tcPr>
-            <w:tcW w:w="9682" w:type="dxa"/>
+            <w:tcW w:w="10476" w:type="dxa"/>
             <w:tcBorders/>
             <w:vAlign w:val="center"/>
           </w:tcPr>
@@ -8987,7 +9028,7 @@
         <w:trPr/>
         <w:tc>
           <w:tcPr>
-            <w:tcW w:w="1657" w:type="dxa"/>
+            <w:tcW w:w="1684" w:type="dxa"/>
             <w:tcBorders/>
             <w:vAlign w:val="center"/>
           </w:tcPr>
@@ -9006,7 +9047,7 @@
         </w:tc>
         <w:tc>
           <w:tcPr>
-            <w:tcW w:w="9682" w:type="dxa"/>
+            <w:tcW w:w="10476" w:type="dxa"/>
             <w:tcBorders/>
             <w:vAlign w:val="center"/>
           </w:tcPr>
@@ -9028,7 +9069,7 @@
         <w:trPr/>
         <w:tc>
           <w:tcPr>
-            <w:tcW w:w="1657" w:type="dxa"/>
+            <w:tcW w:w="1684" w:type="dxa"/>
             <w:tcBorders/>
             <w:vAlign w:val="center"/>
           </w:tcPr>
@@ -9047,7 +9088,7 @@
         </w:tc>
         <w:tc>
           <w:tcPr>
-            <w:tcW w:w="9682" w:type="dxa"/>
+            <w:tcW w:w="10476" w:type="dxa"/>
             <w:tcBorders/>
             <w:vAlign w:val="center"/>
           </w:tcPr>
@@ -9069,7 +9110,7 @@
         <w:trPr/>
         <w:tc>
           <w:tcPr>
-            <w:tcW w:w="1657" w:type="dxa"/>
+            <w:tcW w:w="1684" w:type="dxa"/>
             <w:tcBorders/>
             <w:vAlign w:val="center"/>
           </w:tcPr>
@@ -9088,7 +9129,7 @@
         </w:tc>
         <w:tc>
           <w:tcPr>
-            <w:tcW w:w="9682" w:type="dxa"/>
+            <w:tcW w:w="10476" w:type="dxa"/>
             <w:tcBorders/>
             <w:vAlign w:val="center"/>
           </w:tcPr>
@@ -9110,7 +9151,7 @@
         <w:trPr/>
         <w:tc>
           <w:tcPr>
-            <w:tcW w:w="1657" w:type="dxa"/>
+            <w:tcW w:w="1684" w:type="dxa"/>
             <w:tcBorders/>
             <w:vAlign w:val="center"/>
           </w:tcPr>
@@ -9129,7 +9170,7 @@
         </w:tc>
         <w:tc>
           <w:tcPr>
-            <w:tcW w:w="9682" w:type="dxa"/>
+            <w:tcW w:w="10476" w:type="dxa"/>
             <w:tcBorders/>
             <w:vAlign w:val="center"/>
           </w:tcPr>
@@ -9151,7 +9192,7 @@
         <w:trPr/>
         <w:tc>
           <w:tcPr>
-            <w:tcW w:w="1657" w:type="dxa"/>
+            <w:tcW w:w="1684" w:type="dxa"/>
             <w:tcBorders/>
             <w:vAlign w:val="center"/>
           </w:tcPr>
@@ -9170,7 +9211,7 @@
         </w:tc>
         <w:tc>
           <w:tcPr>
-            <w:tcW w:w="9682" w:type="dxa"/>
+            <w:tcW w:w="10476" w:type="dxa"/>
             <w:tcBorders/>
             <w:vAlign w:val="center"/>
           </w:tcPr>
@@ -9192,7 +9233,7 @@
         <w:trPr/>
         <w:tc>
           <w:tcPr>
-            <w:tcW w:w="1657" w:type="dxa"/>
+            <w:tcW w:w="1684" w:type="dxa"/>
             <w:tcBorders/>
             <w:vAlign w:val="center"/>
           </w:tcPr>
@@ -9211,7 +9252,7 @@
         </w:tc>
         <w:tc>
           <w:tcPr>
-            <w:tcW w:w="9682" w:type="dxa"/>
+            <w:tcW w:w="10476" w:type="dxa"/>
             <w:tcBorders/>
             <w:vAlign w:val="center"/>
           </w:tcPr>
@@ -9233,7 +9274,7 @@
         <w:trPr/>
         <w:tc>
           <w:tcPr>
-            <w:tcW w:w="1657" w:type="dxa"/>
+            <w:tcW w:w="1684" w:type="dxa"/>
             <w:tcBorders/>
             <w:vAlign w:val="center"/>
           </w:tcPr>
@@ -9252,7 +9293,7 @@
         </w:tc>
         <w:tc>
           <w:tcPr>
-            <w:tcW w:w="9682" w:type="dxa"/>
+            <w:tcW w:w="10476" w:type="dxa"/>
             <w:tcBorders/>
             <w:vAlign w:val="center"/>
           </w:tcPr>
@@ -9274,7 +9315,7 @@
         <w:trPr/>
         <w:tc>
           <w:tcPr>
-            <w:tcW w:w="1657" w:type="dxa"/>
+            <w:tcW w:w="1684" w:type="dxa"/>
             <w:tcBorders/>
             <w:vAlign w:val="center"/>
           </w:tcPr>
@@ -9293,7 +9334,7 @@
         </w:tc>
         <w:tc>
           <w:tcPr>
-            <w:tcW w:w="9682" w:type="dxa"/>
+            <w:tcW w:w="10476" w:type="dxa"/>
             <w:tcBorders/>
             <w:vAlign w:val="center"/>
           </w:tcPr>
@@ -9315,7 +9356,7 @@
         <w:trPr/>
         <w:tc>
           <w:tcPr>
-            <w:tcW w:w="1657" w:type="dxa"/>
+            <w:tcW w:w="1684" w:type="dxa"/>
             <w:tcBorders/>
             <w:vAlign w:val="center"/>
           </w:tcPr>
@@ -9334,7 +9375,7 @@
         </w:tc>
         <w:tc>
           <w:tcPr>
-            <w:tcW w:w="9682" w:type="dxa"/>
+            <w:tcW w:w="10476" w:type="dxa"/>
             <w:tcBorders/>
             <w:vAlign w:val="center"/>
           </w:tcPr>
@@ -9356,7 +9397,7 @@
         <w:trPr/>
         <w:tc>
           <w:tcPr>
-            <w:tcW w:w="1657" w:type="dxa"/>
+            <w:tcW w:w="1684" w:type="dxa"/>
             <w:tcBorders/>
             <w:vAlign w:val="center"/>
           </w:tcPr>
@@ -9375,7 +9416,7 @@
         </w:tc>
         <w:tc>
           <w:tcPr>
-            <w:tcW w:w="9682" w:type="dxa"/>
+            <w:tcW w:w="10476" w:type="dxa"/>
             <w:tcBorders/>
             <w:vAlign w:val="center"/>
           </w:tcPr>
@@ -9397,7 +9438,7 @@
         <w:trPr/>
         <w:tc>
           <w:tcPr>
-            <w:tcW w:w="1657" w:type="dxa"/>
+            <w:tcW w:w="1684" w:type="dxa"/>
             <w:tcBorders/>
             <w:vAlign w:val="center"/>
           </w:tcPr>
@@ -9416,7 +9457,7 @@
         </w:tc>
         <w:tc>
           <w:tcPr>
-            <w:tcW w:w="9682" w:type="dxa"/>
+            <w:tcW w:w="10476" w:type="dxa"/>
             <w:tcBorders/>
             <w:vAlign w:val="center"/>
           </w:tcPr>
@@ -9438,7 +9479,7 @@
         <w:trPr/>
         <w:tc>
           <w:tcPr>
-            <w:tcW w:w="1657" w:type="dxa"/>
+            <w:tcW w:w="1684" w:type="dxa"/>
             <w:tcBorders/>
             <w:vAlign w:val="center"/>
           </w:tcPr>
@@ -9457,7 +9498,7 @@
         </w:tc>
         <w:tc>
           <w:tcPr>
-            <w:tcW w:w="9682" w:type="dxa"/>
+            <w:tcW w:w="10476" w:type="dxa"/>
             <w:tcBorders/>
             <w:vAlign w:val="center"/>
           </w:tcPr>
@@ -9479,7 +9520,7 @@
         <w:trPr/>
         <w:tc>
           <w:tcPr>
-            <w:tcW w:w="1657" w:type="dxa"/>
+            <w:tcW w:w="1684" w:type="dxa"/>
             <w:tcBorders/>
             <w:vAlign w:val="center"/>
           </w:tcPr>
@@ -9498,7 +9539,7 @@
         </w:tc>
         <w:tc>
           <w:tcPr>
-            <w:tcW w:w="9682" w:type="dxa"/>
+            <w:tcW w:w="10476" w:type="dxa"/>
             <w:tcBorders/>
             <w:vAlign w:val="center"/>
           </w:tcPr>
@@ -9520,7 +9561,7 @@
         <w:trPr/>
         <w:tc>
           <w:tcPr>
-            <w:tcW w:w="1657" w:type="dxa"/>
+            <w:tcW w:w="1684" w:type="dxa"/>
             <w:tcBorders/>
             <w:vAlign w:val="center"/>
           </w:tcPr>
@@ -9539,7 +9580,7 @@
         </w:tc>
         <w:tc>
           <w:tcPr>
-            <w:tcW w:w="9682" w:type="dxa"/>
+            <w:tcW w:w="10476" w:type="dxa"/>
             <w:tcBorders/>
             <w:vAlign w:val="center"/>
           </w:tcPr>
@@ -9561,7 +9602,7 @@
         <w:trPr/>
         <w:tc>
           <w:tcPr>
-            <w:tcW w:w="1657" w:type="dxa"/>
+            <w:tcW w:w="1684" w:type="dxa"/>
             <w:tcBorders/>
             <w:vAlign w:val="center"/>
           </w:tcPr>
@@ -9580,7 +9621,7 @@
         </w:tc>
         <w:tc>
           <w:tcPr>
-            <w:tcW w:w="9682" w:type="dxa"/>
+            <w:tcW w:w="10476" w:type="dxa"/>
             <w:tcBorders/>
             <w:vAlign w:val="center"/>
           </w:tcPr>
@@ -9602,7 +9643,7 @@
         <w:trPr/>
         <w:tc>
           <w:tcPr>
-            <w:tcW w:w="1657" w:type="dxa"/>
+            <w:tcW w:w="1684" w:type="dxa"/>
             <w:tcBorders/>
             <w:vAlign w:val="center"/>
           </w:tcPr>
@@ -9621,7 +9662,7 @@
         </w:tc>
         <w:tc>
           <w:tcPr>
-            <w:tcW w:w="9682" w:type="dxa"/>
+            <w:tcW w:w="10476" w:type="dxa"/>
             <w:tcBorders/>
             <w:vAlign w:val="center"/>
           </w:tcPr>
@@ -9643,7 +9684,7 @@
         <w:trPr/>
         <w:tc>
           <w:tcPr>
-            <w:tcW w:w="1657" w:type="dxa"/>
+            <w:tcW w:w="1684" w:type="dxa"/>
             <w:tcBorders/>
             <w:vAlign w:val="center"/>
           </w:tcPr>
@@ -9662,7 +9703,7 @@
         </w:tc>
         <w:tc>
           <w:tcPr>
-            <w:tcW w:w="9682" w:type="dxa"/>
+            <w:tcW w:w="10476" w:type="dxa"/>
             <w:tcBorders/>
             <w:vAlign w:val="center"/>
           </w:tcPr>
@@ -9684,7 +9725,7 @@
         <w:trPr/>
         <w:tc>
           <w:tcPr>
-            <w:tcW w:w="1657" w:type="dxa"/>
+            <w:tcW w:w="1684" w:type="dxa"/>
             <w:tcBorders/>
             <w:vAlign w:val="center"/>
           </w:tcPr>
@@ -9703,7 +9744,7 @@
         </w:tc>
         <w:tc>
           <w:tcPr>
-            <w:tcW w:w="9682" w:type="dxa"/>
+            <w:tcW w:w="10476" w:type="dxa"/>
             <w:tcBorders/>
             <w:vAlign w:val="center"/>
           </w:tcPr>
@@ -9725,7 +9766,7 @@
         <w:trPr/>
         <w:tc>
           <w:tcPr>
-            <w:tcW w:w="1657" w:type="dxa"/>
+            <w:tcW w:w="1684" w:type="dxa"/>
             <w:tcBorders/>
             <w:vAlign w:val="center"/>
           </w:tcPr>
@@ -9744,7 +9785,7 @@
         </w:tc>
         <w:tc>
           <w:tcPr>
-            <w:tcW w:w="9682" w:type="dxa"/>
+            <w:tcW w:w="10476" w:type="dxa"/>
             <w:tcBorders/>
             <w:vAlign w:val="center"/>
           </w:tcPr>
@@ -9766,7 +9807,7 @@
         <w:trPr/>
         <w:tc>
           <w:tcPr>
-            <w:tcW w:w="1657" w:type="dxa"/>
+            <w:tcW w:w="1684" w:type="dxa"/>
             <w:tcBorders/>
             <w:vAlign w:val="center"/>
           </w:tcPr>
@@ -9785,7 +9826,7 @@
         </w:tc>
         <w:tc>
           <w:tcPr>
-            <w:tcW w:w="9682" w:type="dxa"/>
+            <w:tcW w:w="10476" w:type="dxa"/>
             <w:tcBorders/>
             <w:vAlign w:val="center"/>
           </w:tcPr>
@@ -9807,7 +9848,7 @@
         <w:trPr/>
         <w:tc>
           <w:tcPr>
-            <w:tcW w:w="1657" w:type="dxa"/>
+            <w:tcW w:w="1684" w:type="dxa"/>
             <w:tcBorders/>
             <w:vAlign w:val="center"/>
           </w:tcPr>
@@ -9826,7 +9867,7 @@
         </w:tc>
         <w:tc>
           <w:tcPr>
-            <w:tcW w:w="9682" w:type="dxa"/>
+            <w:tcW w:w="10476" w:type="dxa"/>
             <w:tcBorders/>
             <w:vAlign w:val="center"/>
           </w:tcPr>
@@ -9848,7 +9889,7 @@
         <w:trPr/>
         <w:tc>
           <w:tcPr>
-            <w:tcW w:w="1657" w:type="dxa"/>
+            <w:tcW w:w="1684" w:type="dxa"/>
             <w:tcBorders/>
             <w:vAlign w:val="center"/>
           </w:tcPr>
@@ -9867,7 +9908,7 @@
         </w:tc>
         <w:tc>
           <w:tcPr>
-            <w:tcW w:w="9682" w:type="dxa"/>
+            <w:tcW w:w="10476" w:type="dxa"/>
             <w:tcBorders/>
             <w:vAlign w:val="center"/>
           </w:tcPr>
@@ -9889,7 +9930,7 @@
         <w:trPr/>
         <w:tc>
           <w:tcPr>
-            <w:tcW w:w="1657" w:type="dxa"/>
+            <w:tcW w:w="1684" w:type="dxa"/>
             <w:tcBorders/>
             <w:vAlign w:val="center"/>
           </w:tcPr>
@@ -9908,7 +9949,7 @@
         </w:tc>
         <w:tc>
           <w:tcPr>
-            <w:tcW w:w="9682" w:type="dxa"/>
+            <w:tcW w:w="10476" w:type="dxa"/>
             <w:tcBorders/>
             <w:vAlign w:val="center"/>
           </w:tcPr>
@@ -9930,7 +9971,7 @@
         <w:trPr/>
         <w:tc>
           <w:tcPr>
-            <w:tcW w:w="1657" w:type="dxa"/>
+            <w:tcW w:w="1684" w:type="dxa"/>
             <w:tcBorders/>
             <w:vAlign w:val="center"/>
           </w:tcPr>
@@ -9949,7 +9990,7 @@
         </w:tc>
         <w:tc>
           <w:tcPr>
-            <w:tcW w:w="9682" w:type="dxa"/>
+            <w:tcW w:w="10476" w:type="dxa"/>
             <w:tcBorders/>
             <w:vAlign w:val="center"/>
           </w:tcPr>
@@ -9971,7 +10012,7 @@
         <w:trPr/>
         <w:tc>
           <w:tcPr>
-            <w:tcW w:w="1657" w:type="dxa"/>
+            <w:tcW w:w="1684" w:type="dxa"/>
             <w:tcBorders/>
             <w:vAlign w:val="center"/>
           </w:tcPr>
@@ -9990,7 +10031,7 @@
         </w:tc>
         <w:tc>
           <w:tcPr>
-            <w:tcW w:w="9682" w:type="dxa"/>
+            <w:tcW w:w="10476" w:type="dxa"/>
             <w:tcBorders/>
             <w:vAlign w:val="center"/>
           </w:tcPr>
@@ -10012,7 +10053,7 @@
         <w:trPr/>
         <w:tc>
           <w:tcPr>
-            <w:tcW w:w="1657" w:type="dxa"/>
+            <w:tcW w:w="1684" w:type="dxa"/>
             <w:tcBorders/>
             <w:vAlign w:val="center"/>
           </w:tcPr>
@@ -10031,7 +10072,7 @@
         </w:tc>
         <w:tc>
           <w:tcPr>
-            <w:tcW w:w="9682" w:type="dxa"/>
+            <w:tcW w:w="10476" w:type="dxa"/>
             <w:tcBorders/>
             <w:vAlign w:val="center"/>
           </w:tcPr>
@@ -10053,7 +10094,7 @@
         <w:trPr/>
         <w:tc>
           <w:tcPr>
-            <w:tcW w:w="1657" w:type="dxa"/>
+            <w:tcW w:w="1684" w:type="dxa"/>
             <w:tcBorders/>
             <w:vAlign w:val="center"/>
           </w:tcPr>
@@ -10072,7 +10113,7 @@
         </w:tc>
         <w:tc>
           <w:tcPr>
-            <w:tcW w:w="9682" w:type="dxa"/>
+            <w:tcW w:w="10476" w:type="dxa"/>
             <w:tcBorders/>
             <w:vAlign w:val="center"/>
           </w:tcPr>
@@ -10094,7 +10135,7 @@
         <w:trPr/>
         <w:tc>
           <w:tcPr>
-            <w:tcW w:w="1657" w:type="dxa"/>
+            <w:tcW w:w="1684" w:type="dxa"/>
             <w:tcBorders/>
             <w:vAlign w:val="center"/>
           </w:tcPr>
@@ -10113,7 +10154,7 @@
         </w:tc>
         <w:tc>
           <w:tcPr>
-            <w:tcW w:w="9682" w:type="dxa"/>
+            <w:tcW w:w="10476" w:type="dxa"/>
             <w:tcBorders/>
             <w:vAlign w:val="center"/>
           </w:tcPr>
@@ -10135,7 +10176,7 @@
         <w:trPr/>
         <w:tc>
           <w:tcPr>
-            <w:tcW w:w="1657" w:type="dxa"/>
+            <w:tcW w:w="1684" w:type="dxa"/>
             <w:tcBorders/>
             <w:vAlign w:val="center"/>
           </w:tcPr>
@@ -10154,7 +10195,7 @@
         </w:tc>
         <w:tc>
           <w:tcPr>
-            <w:tcW w:w="9682" w:type="dxa"/>
+            <w:tcW w:w="10476" w:type="dxa"/>
             <w:tcBorders/>
             <w:vAlign w:val="center"/>
           </w:tcPr>
@@ -10176,7 +10217,7 @@
         <w:trPr/>
         <w:tc>
           <w:tcPr>
-            <w:tcW w:w="1657" w:type="dxa"/>
+            <w:tcW w:w="1684" w:type="dxa"/>
             <w:tcBorders/>
             <w:vAlign w:val="center"/>
           </w:tcPr>
@@ -10195,7 +10236,7 @@
         </w:tc>
         <w:tc>
           <w:tcPr>
-            <w:tcW w:w="9682" w:type="dxa"/>
+            <w:tcW w:w="10476" w:type="dxa"/>
             <w:tcBorders/>
             <w:vAlign w:val="center"/>
           </w:tcPr>
@@ -10217,7 +10258,7 @@
         <w:trPr/>
         <w:tc>
           <w:tcPr>
-            <w:tcW w:w="1657" w:type="dxa"/>
+            <w:tcW w:w="1684" w:type="dxa"/>
             <w:tcBorders/>
             <w:vAlign w:val="center"/>
           </w:tcPr>
@@ -10236,7 +10277,7 @@
         </w:tc>
         <w:tc>
           <w:tcPr>
-            <w:tcW w:w="9682" w:type="dxa"/>
+            <w:tcW w:w="10476" w:type="dxa"/>
             <w:tcBorders/>
             <w:vAlign w:val="center"/>
           </w:tcPr>

</xml_diff>

<commit_message>
Harden sight persistence and stage motion models
</commit_message>
<xml_diff>
--- a/docs/v2/output/Celestial_Navigation_Manual_v2.docx
+++ b/docs/v2/output/Celestial_Navigation_Manual_v2.docx
@@ -54,7 +54,7 @@
       </w:pPr>
       <w:r>
         <w:rPr/>
-        <w:t>Celestial Navigation plugin 2.7.9 development fork</w:t>
+        <w:t>Celestial Navigation plugin 2.8.0 development fork</w:t>
         <w:br/>
         <w:t>Documentation revision 2 September 2026</w:t>
       </w:r>
@@ -2807,7 +2807,7 @@
         <w:rPr/>
         <w:drawing>
           <wp:inline distT="0" distB="0" distL="0" distR="0">
-            <wp:extent cx="5850000" cy="2991302"/>
+            <wp:extent cx="5850000" cy="2992880"/>
             <wp:effectExtent l="0" t="0" r="0" b="0"/>
             <wp:docPr id="6" name="Image6" title="Two globes comparing the predicted geographic position with correct UTC and a watch twenty minutes slow."/>
             <wp:cNvGraphicFramePr>
@@ -2831,7 +2831,7 @@
                   <pic:spPr bwMode="auto">
                     <a:xfrm>
                       <a:off x="0" y="0"/>
-                      <a:ext cx="5850000" cy="2991302"/>
+                      <a:ext cx="5850000" cy="2992880"/>
                     </a:xfrm>
                     <a:prstGeom prst="rect">
                       <a:avLst/>

</xml_diff>

<commit_message>
Add verified eclipse data installer
</commit_message>
<xml_diff>
--- a/docs/v2/output/Celestial_Navigation_Manual_v2.docx
+++ b/docs/v2/output/Celestial_Navigation_Manual_v2.docx
@@ -2807,7 +2807,7 @@
         <w:rPr/>
         <w:drawing>
           <wp:inline distT="0" distB="0" distL="0" distR="0">
-            <wp:extent cx="5850000" cy="2992880"/>
+            <wp:extent cx="5850000" cy="2991302"/>
             <wp:effectExtent l="0" t="0" r="0" b="0"/>
             <wp:docPr id="6" name="Image6" title="Two globes comparing the predicted geographic position with correct UTC and a watch twenty minutes slow."/>
             <wp:cNvGraphicFramePr>
@@ -2831,7 +2831,7 @@
                   <pic:spPr bwMode="auto">
                     <a:xfrm>
                       <a:off x="0" y="0"/>
-                      <a:ext cx="5850000" cy="2992880"/>
+                      <a:ext cx="5850000" cy="2991302"/>
                     </a:xfrm>
                     <a:prstGeom prst="rect">
                       <a:avLst/>
@@ -6688,7 +6688,7 @@
       </w:pPr>
       <w:r>
         <w:rPr/>
-        <w:t>The eclipse planner is a separate specialist module within the plugin. It uses a locally imported JPL DE440s ephemeris to search events and calculate geometry without network access.</w:t>
+        <w:t>The eclipse planner is a separate specialist module within the plugin. It uses a locally installed JPL DE440s ephemeris to search events and calculate geometry without network access. The data can be downloaded on an explicit user request or imported from a local copy.</w:t>
       </w:r>
     </w:p>
     <w:p>
@@ -6780,6 +6780,54 @@
       <w:r>
         <w:rPr/>
         <w:t xml:space="preserve"> optional lunar-topography refinement of contact timing; not required for ordinary eclipse use. </w:t>
+      </w:r>
+    </w:p>
+    <w:p>
+      <w:pPr>
+        <w:pStyle w:val="BodyText"/>
+        <w:bidi w:val="0"/>
+        <w:rPr/>
+      </w:pPr>
+      <w:r>
+        <w:rPr/>
+        <w:t xml:space="preserve">Select </w:t>
+      </w:r>
+      <w:r>
+        <w:rPr>
+          <w:rStyle w:val="Strong"/>
+        </w:rPr>
+        <w:t>Download and install DE440s… (31.2 MiB)</w:t>
+      </w:r>
+      <w:r>
+        <w:rPr/>
+        <w:t xml:space="preserve"> for the base eclipse data. The download is staged, checked for its exact size and SHA-256 digest, inspected for the expected SPK structure and then installed atomically. If a source fails, the plugin tries another trusted project or NASA/JPL source. </w:t>
+      </w:r>
+      <w:r>
+        <w:rPr>
+          <w:rStyle w:val="Strong"/>
+        </w:rPr>
+        <w:t>Import DE440s…</w:t>
+      </w:r>
+      <w:r>
+        <w:rPr/>
+        <w:t xml:space="preserve"> applies the same verification and safe-installation process to a local file.</w:t>
+      </w:r>
+    </w:p>
+    <w:p>
+      <w:pPr>
+        <w:pStyle w:val="BodyText"/>
+        <w:bidi w:val="0"/>
+        <w:rPr/>
+      </w:pPr>
+      <w:r>
+        <w:rPr>
+          <w:rStyle w:val="Strong"/>
+        </w:rPr>
+        <w:t>Optional lunar data…</w:t>
+      </w:r>
+      <w:r>
+        <w:rPr/>
+        <w:t xml:space="preserve"> opens a separate explanation and separate download/import controls for the 12.3 MiB lunar-orientation kernel and the 506 MiB LOLA terrain pack. Neither is downloaded when DE440s is installed. If LOLA is selected without lunar orientation already installed, the plugin shows the combined download and temporary disk-space requirement and asks for confirmation before downloading either file. Downloads can be cancelled; a partial or unverified file is never installed.</w:t>
       </w:r>
     </w:p>
     <w:p>
@@ -7759,7 +7807,17 @@
             </w:pPr>
             <w:r>
               <w:rPr/>
-              <w:t>Import DE440s and recheck data status. LOLA is optional and should not block ordinary eclipse plotting.</w:t>
+              <w:t xml:space="preserve">Select </w:t>
+            </w:r>
+            <w:r>
+              <w:rPr>
+                <w:rStyle w:val="Strong"/>
+              </w:rPr>
+              <w:t>Download and install DE440s…</w:t>
+            </w:r>
+            <w:r>
+              <w:rPr/>
+              <w:t>, or import a local DE440s copy, and wait for verification to complete. LOLA and lunar orientation are optional and should not block ordinary eclipse plotting.</w:t>
             </w:r>
           </w:p>
         </w:tc>

</xml_diff>

<commit_message>
Address celestial workflow review feedback
</commit_message>
<xml_diff>
--- a/docs/v2/output/Celestial_Navigation_Manual_v2.docx
+++ b/docs/v2/output/Celestial_Navigation_Manual_v2.docx
@@ -54,9 +54,9 @@
       </w:pPr>
       <w:r>
         <w:rPr/>
-        <w:t>Celestial Navigation plugin 2.8.0 development fork</w:t>
+        <w:t>Celestial Navigation plugin 2.8.1</w:t>
         <w:br/>
-        <w:t>Documentation revision 2 September 2026</w:t>
+        <w:t>Documentation revision 3 September 2026</w:t>
       </w:r>
     </w:p>
     <w:p>
@@ -5455,6 +5455,17 @@
     </w:p>
     <w:p>
       <w:pPr>
+        <w:pStyle w:val="BodyText"/>
+        <w:bidi w:val="0"/>
+        <w:rPr/>
+      </w:pPr>
+      <w:r>
+        <w:rPr/>
+        <w:t>In stationary mode each sight retains its own saved DR position. In moving observer mode one COG/SOG track is fitted across the selected observations. The analyzer warns when that constant-motion model spans more than 24 hours; split unrelated sessions rather than treating months of observations as one continuous vessel track.</w:t>
+      </w:r>
+    </w:p>
+    <w:p>
+      <w:pPr>
         <w:pStyle w:val="Heading2"/>
         <w:bidi w:val="0"/>
         <w:rPr/>
@@ -5916,6 +5927,17 @@
       <w:pPr>
         <w:pStyle w:val="BodyText"/>
         <w:bidi w:val="0"/>
+        <w:rPr/>
+      </w:pPr>
+      <w:r>
+        <w:rPr/>
+        <w:t>The simultaneous solver uses the direct spherical-triangle clearing method. Its calculation detail shows the instrument, horizon and limb reductions; refraction and parallax in altitude; the two spherical-cosine steps; and the ephemeris matching. Entered one-sigma angle uncertainties are shown separately: they are propagated through the clearing geometry and local lunar-distance rate to estimate UTC uncertainty, not applied as additional corrections.</w:t>
+      </w:r>
+    </w:p>
+    <w:p>
+      <w:pPr>
+        <w:pStyle w:val="BodyText"/>
+        <w:bidi w:val="0"/>
         <w:ind w:hanging="0" w:start="0" w:end="0"/>
         <w:rPr/>
       </w:pPr>
@@ -6230,6 +6252,37 @@
       </w:pPr>
       <w:r>
         <w:rPr/>
+        <w:t xml:space="preserve">Lunar Tools defaults to </w:t>
+      </w:r>
+      <w:r>
+        <w:rPr>
+          <w:rStyle w:val="Strong"/>
+        </w:rPr>
+        <w:t>Nautical: YYYY-MM-DD, 24-hour</w:t>
+      </w:r>
+      <w:r>
+        <w:rPr/>
+        <w:t xml:space="preserve"> UTC entry for an unambiguous cross-platform display. Select </w:t>
+      </w:r>
+      <w:r>
+        <w:rPr>
+          <w:rStyle w:val="Strong"/>
+        </w:rPr>
+        <w:t>OpenCPN / platform format</w:t>
+      </w:r>
+      <w:r>
+        <w:rPr/>
+        <w:t xml:space="preserve"> when the native operating-system date/time controls are preferred. Changing presentation preserves the entered instant.</w:t>
+      </w:r>
+    </w:p>
+    <w:p>
+      <w:pPr>
+        <w:pStyle w:val="BodyText"/>
+        <w:bidi w:val="0"/>
+        <w:rPr/>
+      </w:pPr>
+      <w:r>
+        <w:rPr/>
         <w:t>The ranking is a planning aid, not a visibility guarantee. Cloud, Moon phase/glare, twilight, haze, telescope field, the chosen limb/contact and the observer's ability remain decisive. Recalculate at candidate times and choose a pair you can identify unambiguously.</w:t>
       </w:r>
     </w:p>
@@ -6343,6 +6396,17 @@
       <w:r>
         <w:rPr/>
         <w:t>The Horizon Event workflow records first upper-limb appearance at sunrise or final upper-limb disappearance at sunset. Timing gives an approximate altitude constraint. An optional bearing adds a rough directional constraint.</w:t>
+      </w:r>
+    </w:p>
+    <w:p>
+      <w:pPr>
+        <w:pStyle w:val="BodyText"/>
+        <w:bidi w:val="0"/>
+        <w:rPr/>
+      </w:pPr>
+      <w:r>
+        <w:rPr/>
+        <w:t>The UTC observation schedule remains fixed at the top of the dialog. On a short display, scroll only the lower bearing, horizon-condition and result section, so the event date and 24-hour UTC time remain visible.</w:t>
       </w:r>
     </w:p>
     <w:p>
@@ -6622,7 +6686,7 @@
       </w:r>
       <w:r>
         <w:rPr/>
-        <w:t xml:space="preserve">. Enter three charted objects in left–centre–right visual order and the included left-centre and centre-right angles. Enter uncertainty and an approximate vessel position to choose among ambiguous solutions. Select </w:t>
+        <w:t xml:space="preserve">. Enter three charted objects in left–centre–right visual order and the included left-centre and centre-right measurements. Landmark coordinates start at 0° N, 0° E so stale vessel coordinates cannot be mistaken for targets. The central sextant index-error default is applied to both angle measurements and remains editable. Enter uncertainty and an approximate vessel position to choose among ambiguous solutions. Select </w:t>
       </w:r>
       <w:r>
         <w:rPr>
@@ -7286,7 +7350,7 @@
             </w:pPr>
             <w:r>
               <w:rPr/>
-              <w:t>Planner date appears in an unexpected order or uses AM/PM</w:t>
+              <w:t>Planner or Lunar Tools date appears in an unexpected order or uses AM/PM</w:t>
             </w:r>
           </w:p>
         </w:tc>

</xml_diff>

<commit_message>
Restore full lunar calculation trail
</commit_message>
<xml_diff>
--- a/docs/v2/output/Celestial_Navigation_Manual_v2.docx
+++ b/docs/v2/output/Celestial_Navigation_Manual_v2.docx
@@ -5900,7 +5900,27 @@
       </w:r>
       <w:r>
         <w:rPr/>
-        <w:t xml:space="preserve">. Review all matching time candidates, clock correction, uncertainty and position candidates. </w:t>
+        <w:t xml:space="preserve">. Use </w:t>
+      </w:r>
+      <w:r>
+        <w:rPr>
+          <w:rStyle w:val="Strong"/>
+        </w:rPr>
+        <w:t>Results</w:t>
+      </w:r>
+      <w:r>
+        <w:rPr/>
+        <w:t xml:space="preserve"> for the operational candidates and </w:t>
+      </w:r>
+      <w:r>
+        <w:rPr>
+          <w:rStyle w:val="Strong"/>
+        </w:rPr>
+        <w:t>Calculations</w:t>
+      </w:r>
+      <w:r>
+        <w:rPr/>
+        <w:t xml:space="preserve"> for the complete auditable working. </w:t>
       </w:r>
     </w:p>
     <w:p>
@@ -5931,7 +5951,38 @@
       </w:pPr>
       <w:r>
         <w:rPr/>
-        <w:t>The simultaneous solver uses the direct spherical-triangle clearing method. Its calculation detail shows the instrument, horizon and limb reductions; refraction and parallax in altitude; the two spherical-cosine steps; and the ephemeris matching. Entered one-sigma angle uncertainties are shown separately: they are propagated through the clearing geometry and local lunar-distance rate to estimate UTC uncertainty, not applied as additional corrections.</w:t>
+        <w:t xml:space="preserve">The lunar result window deliberately has two pages. </w:t>
+      </w:r>
+      <w:r>
+        <w:rPr>
+          <w:rStyle w:val="Strong"/>
+        </w:rPr>
+        <w:t>Results</w:t>
+      </w:r>
+      <w:r>
+        <w:rPr/>
+        <w:t xml:space="preserve"> is the concise operational view: possible UTC values, watch correction, lunar-distance rate, estimated UTC uncertainty, position candidates and warnings. </w:t>
+      </w:r>
+      <w:r>
+        <w:rPr>
+          <w:rStyle w:val="Strong"/>
+        </w:rPr>
+        <w:t>Calculations</w:t>
+      </w:r>
+      <w:r>
+        <w:rPr/>
+        <w:t xml:space="preserve"> preserves the educational and auditable working. In simultaneous mode it shows the raw observations and conventions; index and dip arithmetic; every limb/contact and semidiameter correction; refraction, parallax and corrected altitudes; both direct spherical-triangle formulae with their numerical substitutions; every coarse UTC scan point; every bisection refinement; converged roots; uncertainty components; altitude- circle construction, position candidates and warnings. It records the calculations actually used by the modern solver rather than the former two-endpoint interpolation.</w:t>
+      </w:r>
+    </w:p>
+    <w:p>
+      <w:pPr>
+        <w:pStyle w:val="BodyText"/>
+        <w:bidi w:val="0"/>
+        <w:rPr/>
+      </w:pPr>
+      <w:r>
+        <w:rPr/>
+        <w:t>Entered one-sigma angle uncertainties are shown separately: they are propagated through the clearing geometry and local lunar-distance rate to estimate UTC uncertainty, not applied as additional corrections.</w:t>
       </w:r>
     </w:p>
     <w:p>

</xml_diff>

<commit_message>
Improve Star Finder recommendation controls
</commit_message>
<xml_diff>
--- a/docs/v2/output/Celestial_Navigation_Manual_v2.docx
+++ b/docs/v2/output/Celestial_Navigation_Manual_v2.docx
@@ -54,9 +54,9 @@
       </w:pPr>
       <w:r>
         <w:rPr/>
-        <w:t>Celestial Navigation plugin 2.8.2</w:t>
+        <w:t>Celestial Navigation plugin 2.8.3</w:t>
         <w:br/>
-        <w:t>Documentation revision 3 September 2026</w:t>
+        <w:t>Documentation revision 4 September 2026</w:t>
       </w:r>
     </w:p>
     <w:p>
@@ -2807,7 +2807,7 @@
         <w:rPr/>
         <w:drawing>
           <wp:inline distT="0" distB="0" distL="0" distR="0">
-            <wp:extent cx="5850000" cy="2991302"/>
+            <wp:extent cx="5850000" cy="2992880"/>
             <wp:effectExtent l="0" t="0" r="0" b="0"/>
             <wp:docPr id="6" name="Image6" title="Two globes comparing the predicted geographic position with correct UTC and a watch twenty minutes slow."/>
             <wp:cNvGraphicFramePr>
@@ -2831,7 +2831,7 @@
                   <pic:spPr bwMode="auto">
                     <a:xfrm>
                       <a:off x="0" y="0"/>
-                      <a:ext cx="5850000" cy="2991302"/>
+                      <a:ext cx="5850000" cy="2992880"/>
                     </a:xfrm>
                     <a:prstGeom prst="rect">
                       <a:avLst/>
@@ -4438,18 +4438,39 @@
       </w:pPr>
       <w:r>
         <w:rPr/>
-        <w:t>The body list shows bodies between 10° and 75° geometric Hc with catalogue magnitude 3 or brighter. Click any column heading to sort the table; click it again to reverse the order. The individual score gives 65% weight to altitude near 40° and 35% to brightness, with a daylight/twilight penalty for stars. Planets currently receive no equivalent twilight penalty, so the score is not by itself a guarantee that Mercury or another planet is practically observable. Suggested pairs additionally favour a crossing angle near 90°; triads rank their two-dimensional bearing geometry separately.</w:t>
-      </w:r>
-    </w:p>
-    <w:p>
-      <w:pPr>
-        <w:pStyle w:val="BodyText"/>
-        <w:bidi w:val="0"/>
-        <w:rPr/>
-      </w:pPr>
-      <w:r>
-        <w:rPr/>
-        <w:t>The polar sky plot has independent magnitude limits of 1, 2 or 3 and can optionally show bodies below the horizon. Sun symbols are yellow, the Moon is blue, planets are red, stars rendered during daylight are grey, and below-horizon bodies are hollow. Labels are attempted only for the first 14 score-ranked bodies and are suppressed when they would overlap; an unlabeled dot does not mean the body is absent from the catalogue.</w:t>
+        <w:t xml:space="preserve">The body list shows every catalogued body whose geometric Hc is at or above the horizon. Click any column heading to sort the table; click it again to reverse the order. </w:t>
+      </w:r>
+      <w:r>
+        <w:rPr>
+          <w:rStyle w:val="Strong"/>
+        </w:rPr>
+        <w:t>Limit recommendations by Hc</w:t>
+      </w:r>
+      <w:r>
+        <w:rPr/>
+        <w:t xml:space="preserve"> optionally applies the adjacent, editable minimum and maximum only to suggested pairs and triads. The initial preferred range is 10°–75°. Bodies outside it remain in the table and are marked below or above the preferred Hc; disabling the option makes every listed body eligible for recommendations.</w:t>
+      </w:r>
+    </w:p>
+    <w:p>
+      <w:pPr>
+        <w:pStyle w:val="BodyText"/>
+        <w:bidi w:val="0"/>
+        <w:rPr/>
+      </w:pPr>
+      <w:r>
+        <w:rPr/>
+        <w:t>The individual score gives 65% weight to altitude near 40° and 35% to brightness, with a daylight/twilight penalty for stars. Planets currently receive no equivalent twilight penalty, so the score is not by itself a guarantee that Mercury or another planet is practically observable. Suggested pairs additionally favour a crossing angle near 90°; triads rank their two-dimensional bearing geometry separately.</w:t>
+      </w:r>
+    </w:p>
+    <w:p>
+      <w:pPr>
+        <w:pStyle w:val="BodyText"/>
+        <w:bidi w:val="0"/>
+        <w:rPr/>
+      </w:pPr>
+      <w:r>
+        <w:rPr/>
+        <w:t>The polar sky plot has independent magnitude limits of 1, 2 or 3 and can optionally show bodies below the horizon. Sun symbols are yellow, the Moon is blue, planets are red, stars rendered during daylight are grey, and below-horizon bodies are hollow. Labels favour the brightest bodies and share the available label allowance across the four compass quadrants. The allowance adapts to the plot size, and labels are still suppressed when they would overlap; an unlabeled dot does not mean the body is absent from the catalogue.</w:t>
       </w:r>
     </w:p>
     <w:p>
@@ -7285,14 +7306,14 @@
         </w:tblCellMar>
       </w:tblPr>
       <w:tblGrid>
-        <w:gridCol w:w="2969"/>
-        <w:gridCol w:w="6781"/>
+        <w:gridCol w:w="2970"/>
+        <w:gridCol w:w="6780"/>
       </w:tblGrid>
       <w:tr>
         <w:trPr/>
         <w:tc>
           <w:tcPr>
-            <w:tcW w:w="2969" w:type="dxa"/>
+            <w:tcW w:w="2970" w:type="dxa"/>
             <w:tcBorders/>
             <w:vAlign w:val="center"/>
           </w:tcPr>
@@ -7314,7 +7335,7 @@
         </w:tc>
         <w:tc>
           <w:tcPr>
-            <w:tcW w:w="6781" w:type="dxa"/>
+            <w:tcW w:w="6780" w:type="dxa"/>
             <w:tcBorders/>
             <w:vAlign w:val="center"/>
           </w:tcPr>
@@ -7339,7 +7360,7 @@
         <w:trPr/>
         <w:tc>
           <w:tcPr>
-            <w:tcW w:w="2969" w:type="dxa"/>
+            <w:tcW w:w="2970" w:type="dxa"/>
             <w:tcBorders/>
             <w:vAlign w:val="center"/>
           </w:tcPr>
@@ -7358,7 +7379,7 @@
         </w:tc>
         <w:tc>
           <w:tcPr>
-            <w:tcW w:w="6781" w:type="dxa"/>
+            <w:tcW w:w="6780" w:type="dxa"/>
             <w:tcBorders/>
             <w:vAlign w:val="center"/>
           </w:tcPr>
@@ -7380,7 +7401,7 @@
         <w:trPr/>
         <w:tc>
           <w:tcPr>
-            <w:tcW w:w="2969" w:type="dxa"/>
+            <w:tcW w:w="2970" w:type="dxa"/>
             <w:tcBorders/>
             <w:vAlign w:val="center"/>
           </w:tcPr>
@@ -7399,7 +7420,7 @@
         </w:tc>
         <w:tc>
           <w:tcPr>
-            <w:tcW w:w="6781" w:type="dxa"/>
+            <w:tcW w:w="6780" w:type="dxa"/>
             <w:tcBorders/>
             <w:vAlign w:val="center"/>
           </w:tcPr>
@@ -7421,7 +7442,7 @@
         <w:trPr/>
         <w:tc>
           <w:tcPr>
-            <w:tcW w:w="2969" w:type="dxa"/>
+            <w:tcW w:w="2970" w:type="dxa"/>
             <w:tcBorders/>
             <w:vAlign w:val="center"/>
           </w:tcPr>
@@ -7440,7 +7461,7 @@
         </w:tc>
         <w:tc>
           <w:tcPr>
-            <w:tcW w:w="6781" w:type="dxa"/>
+            <w:tcW w:w="6780" w:type="dxa"/>
             <w:tcBorders/>
             <w:vAlign w:val="center"/>
           </w:tcPr>
@@ -7462,7 +7483,7 @@
         <w:trPr/>
         <w:tc>
           <w:tcPr>
-            <w:tcW w:w="2969" w:type="dxa"/>
+            <w:tcW w:w="2970" w:type="dxa"/>
             <w:tcBorders/>
             <w:vAlign w:val="center"/>
           </w:tcPr>
@@ -7481,7 +7502,7 @@
         </w:tc>
         <w:tc>
           <w:tcPr>
-            <w:tcW w:w="6781" w:type="dxa"/>
+            <w:tcW w:w="6780" w:type="dxa"/>
             <w:tcBorders/>
             <w:vAlign w:val="center"/>
           </w:tcPr>
@@ -7503,7 +7524,7 @@
         <w:trPr/>
         <w:tc>
           <w:tcPr>
-            <w:tcW w:w="2969" w:type="dxa"/>
+            <w:tcW w:w="2970" w:type="dxa"/>
             <w:tcBorders/>
             <w:vAlign w:val="center"/>
           </w:tcPr>
@@ -7522,7 +7543,7 @@
         </w:tc>
         <w:tc>
           <w:tcPr>
-            <w:tcW w:w="6781" w:type="dxa"/>
+            <w:tcW w:w="6780" w:type="dxa"/>
             <w:tcBorders/>
             <w:vAlign w:val="center"/>
           </w:tcPr>
@@ -7554,7 +7575,7 @@
         <w:trPr/>
         <w:tc>
           <w:tcPr>
-            <w:tcW w:w="2969" w:type="dxa"/>
+            <w:tcW w:w="2970" w:type="dxa"/>
             <w:tcBorders/>
             <w:vAlign w:val="center"/>
           </w:tcPr>
@@ -7573,7 +7594,7 @@
         </w:tc>
         <w:tc>
           <w:tcPr>
-            <w:tcW w:w="6781" w:type="dxa"/>
+            <w:tcW w:w="6780" w:type="dxa"/>
             <w:tcBorders/>
             <w:vAlign w:val="center"/>
           </w:tcPr>
@@ -7595,7 +7616,7 @@
         <w:trPr/>
         <w:tc>
           <w:tcPr>
-            <w:tcW w:w="2969" w:type="dxa"/>
+            <w:tcW w:w="2970" w:type="dxa"/>
             <w:tcBorders/>
             <w:vAlign w:val="center"/>
           </w:tcPr>
@@ -7614,20 +7635,20 @@
         </w:tc>
         <w:tc>
           <w:tcPr>
-            <w:tcW w:w="6781" w:type="dxa"/>
-            <w:tcBorders/>
-            <w:vAlign w:val="center"/>
-          </w:tcPr>
-          <w:p>
-            <w:pPr>
-              <w:pStyle w:val="TableContents"/>
-              <w:bidi w:val="0"/>
-              <w:spacing w:before="0" w:after="283"/>
-              <w:rPr/>
-            </w:pPr>
-            <w:r>
-              <w:rPr/>
-              <w:t>Only the first 14 score-ranked bodies are considered for labels, and overlapping labels are suppressed. Use the sortable body table to identify and inspect all listed bodies.</w:t>
+            <w:tcW w:w="6780" w:type="dxa"/>
+            <w:tcBorders/>
+            <w:vAlign w:val="center"/>
+          </w:tcPr>
+          <w:p>
+            <w:pPr>
+              <w:pStyle w:val="TableContents"/>
+              <w:bidi w:val="0"/>
+              <w:spacing w:before="0" w:after="283"/>
+              <w:rPr/>
+            </w:pPr>
+            <w:r>
+              <w:rPr/>
+              <w:t>Labels favour bright bodies, are shared across compass quadrants and are suppressed when they would overlap. Enlarge the planner or use the sortable body table to identify and inspect every listed body.</w:t>
             </w:r>
           </w:p>
         </w:tc>
@@ -7636,39 +7657,49 @@
         <w:trPr/>
         <w:tc>
           <w:tcPr>
-            <w:tcW w:w="2969" w:type="dxa"/>
-            <w:tcBorders/>
-            <w:vAlign w:val="center"/>
-          </w:tcPr>
-          <w:p>
-            <w:pPr>
-              <w:pStyle w:val="TableContents"/>
-              <w:bidi w:val="0"/>
-              <w:spacing w:before="0" w:after="283"/>
-              <w:rPr/>
-            </w:pPr>
-            <w:r>
-              <w:rPr/>
-              <w:t>GNSS UTC unavailable</w:t>
-            </w:r>
-          </w:p>
-        </w:tc>
-        <w:tc>
-          <w:tcPr>
-            <w:tcW w:w="6781" w:type="dxa"/>
-            <w:tcBorders/>
-            <w:vAlign w:val="center"/>
-          </w:tcPr>
-          <w:p>
-            <w:pPr>
-              <w:pStyle w:val="TableContents"/>
-              <w:bidi w:val="0"/>
-              <w:spacing w:before="0" w:after="283"/>
-              <w:rPr/>
-            </w:pPr>
-            <w:r>
-              <w:rPr/>
-              <w:t>Confirm a valid NMEA RMC or ZDA sentence is reaching OpenCPN. The plugin does not infer GNSS time from position alone.</w:t>
+            <w:tcW w:w="2970" w:type="dxa"/>
+            <w:tcBorders/>
+            <w:vAlign w:val="center"/>
+          </w:tcPr>
+          <w:p>
+            <w:pPr>
+              <w:pStyle w:val="TableContents"/>
+              <w:bidi w:val="0"/>
+              <w:spacing w:before="0" w:after="283"/>
+              <w:rPr/>
+            </w:pPr>
+            <w:r>
+              <w:rPr/>
+              <w:t>A body is listed but absent from the recommended pairs or triads</w:t>
+            </w:r>
+          </w:p>
+        </w:tc>
+        <w:tc>
+          <w:tcPr>
+            <w:tcW w:w="6780" w:type="dxa"/>
+            <w:tcBorders/>
+            <w:vAlign w:val="center"/>
+          </w:tcPr>
+          <w:p>
+            <w:pPr>
+              <w:pStyle w:val="TableContents"/>
+              <w:bidi w:val="0"/>
+              <w:spacing w:before="0" w:after="283"/>
+              <w:rPr/>
+            </w:pPr>
+            <w:r>
+              <w:rPr/>
+              <w:t xml:space="preserve">Check </w:t>
+            </w:r>
+            <w:r>
+              <w:rPr>
+                <w:rStyle w:val="Strong"/>
+              </w:rPr>
+              <w:t>Limit recommendations by Hc</w:t>
+            </w:r>
+            <w:r>
+              <w:rPr/>
+              <w:t xml:space="preserve"> and its preferred minimum and maximum. Bodies outside the range remain available in the table but are deliberately excluded from recommendations while the limit is enabled.</w:t>
             </w:r>
           </w:p>
         </w:tc>
@@ -7677,39 +7708,39 @@
         <w:trPr/>
         <w:tc>
           <w:tcPr>
-            <w:tcW w:w="2969" w:type="dxa"/>
-            <w:tcBorders/>
-            <w:vAlign w:val="center"/>
-          </w:tcPr>
-          <w:p>
-            <w:pPr>
-              <w:pStyle w:val="TableContents"/>
-              <w:bidi w:val="0"/>
-              <w:spacing w:before="0" w:after="283"/>
-              <w:rPr/>
-            </w:pPr>
-            <w:r>
-              <w:rPr/>
-              <w:t>Chrony status unavailable</w:t>
-            </w:r>
-          </w:p>
-        </w:tc>
-        <w:tc>
-          <w:tcPr>
-            <w:tcW w:w="6781" w:type="dxa"/>
-            <w:tcBorders/>
-            <w:vAlign w:val="center"/>
-          </w:tcPr>
-          <w:p>
-            <w:pPr>
-              <w:pStyle w:val="TableContents"/>
-              <w:bidi w:val="0"/>
-              <w:spacing w:before="0" w:after="283"/>
-              <w:rPr/>
-            </w:pPr>
-            <w:r>
-              <w:rPr/>
-              <w:t>The computer may use another synchronisation service, chrony may not be installed, or its query interface may be unavailable. UTC display still uses the system clock.</w:t>
+            <w:tcW w:w="2970" w:type="dxa"/>
+            <w:tcBorders/>
+            <w:vAlign w:val="center"/>
+          </w:tcPr>
+          <w:p>
+            <w:pPr>
+              <w:pStyle w:val="TableContents"/>
+              <w:bidi w:val="0"/>
+              <w:spacing w:before="0" w:after="283"/>
+              <w:rPr/>
+            </w:pPr>
+            <w:r>
+              <w:rPr/>
+              <w:t>An invalid planner date or time leaves no results</w:t>
+            </w:r>
+          </w:p>
+        </w:tc>
+        <w:tc>
+          <w:tcPr>
+            <w:tcW w:w="6780" w:type="dxa"/>
+            <w:tcBorders/>
+            <w:vAlign w:val="center"/>
+          </w:tcPr>
+          <w:p>
+            <w:pPr>
+              <w:pStyle w:val="TableContents"/>
+              <w:bidi w:val="0"/>
+              <w:spacing w:before="0" w:after="283"/>
+              <w:rPr/>
+            </w:pPr>
+            <w:r>
+              <w:rPr/>
+              <w:t>This is intentional: the plugin clears previously calculated events, bodies, almanac and helper results so stale output cannot be mistaken for the invalid planning context. Correct the entry using YYYY-MM-DD and HH:MM:SS.</w:t>
             </w:r>
           </w:p>
         </w:tc>
@@ -7718,39 +7749,39 @@
         <w:trPr/>
         <w:tc>
           <w:tcPr>
-            <w:tcW w:w="2969" w:type="dxa"/>
-            <w:tcBorders/>
-            <w:vAlign w:val="center"/>
-          </w:tcPr>
-          <w:p>
-            <w:pPr>
-              <w:pStyle w:val="TableContents"/>
-              <w:bidi w:val="0"/>
-              <w:spacing w:before="0" w:after="283"/>
-              <w:rPr/>
-            </w:pPr>
-            <w:r>
-              <w:rPr/>
-              <w:t>Lunar solver finds several times</w:t>
-            </w:r>
-          </w:p>
-        </w:tc>
-        <w:tc>
-          <w:tcPr>
-            <w:tcW w:w="6781" w:type="dxa"/>
-            <w:tcBorders/>
-            <w:vAlign w:val="center"/>
-          </w:tcPr>
-          <w:p>
-            <w:pPr>
-              <w:pStyle w:val="TableContents"/>
-              <w:bidi w:val="0"/>
-              <w:spacing w:before="0" w:after="283"/>
-              <w:rPr/>
-            </w:pPr>
-            <w:r>
-              <w:rPr/>
-              <w:t>Narrow the search only when justified; check contact/limbs and altitudes; use DR/hemisphere or another sight to resolve candidates.</w:t>
+            <w:tcW w:w="2970" w:type="dxa"/>
+            <w:tcBorders/>
+            <w:vAlign w:val="center"/>
+          </w:tcPr>
+          <w:p>
+            <w:pPr>
+              <w:pStyle w:val="TableContents"/>
+              <w:bidi w:val="0"/>
+              <w:spacing w:before="0" w:after="283"/>
+              <w:rPr/>
+            </w:pPr>
+            <w:r>
+              <w:rPr/>
+              <w:t>GNSS UTC unavailable</w:t>
+            </w:r>
+          </w:p>
+        </w:tc>
+        <w:tc>
+          <w:tcPr>
+            <w:tcW w:w="6780" w:type="dxa"/>
+            <w:tcBorders/>
+            <w:vAlign w:val="center"/>
+          </w:tcPr>
+          <w:p>
+            <w:pPr>
+              <w:pStyle w:val="TableContents"/>
+              <w:bidi w:val="0"/>
+              <w:spacing w:before="0" w:after="283"/>
+              <w:rPr/>
+            </w:pPr>
+            <w:r>
+              <w:rPr/>
+              <w:t>Confirm a valid NMEA RMC or ZDA sentence is reaching OpenCPN. The plugin does not infer GNSS time from position alone.</w:t>
             </w:r>
           </w:p>
         </w:tc>
@@ -7759,39 +7790,39 @@
         <w:trPr/>
         <w:tc>
           <w:tcPr>
-            <w:tcW w:w="2969" w:type="dxa"/>
-            <w:tcBorders/>
-            <w:vAlign w:val="center"/>
-          </w:tcPr>
-          <w:p>
-            <w:pPr>
-              <w:pStyle w:val="TableContents"/>
-              <w:bidi w:val="0"/>
-              <w:spacing w:before="0" w:after="283"/>
-              <w:rPr/>
-            </w:pPr>
-            <w:r>
-              <w:rPr/>
-              <w:t>Lunar solution is unstable</w:t>
-            </w:r>
-          </w:p>
-        </w:tc>
-        <w:tc>
-          <w:tcPr>
-            <w:tcW w:w="6781" w:type="dxa"/>
-            <w:tcBorders/>
-            <w:vAlign w:val="center"/>
-          </w:tcPr>
-          <w:p>
-            <w:pPr>
-              <w:pStyle w:val="TableContents"/>
-              <w:bidi w:val="0"/>
-              <w:spacing w:before="0" w:after="283"/>
-              <w:rPr/>
-            </w:pPr>
-            <w:r>
-              <w:rPr/>
-              <w:t>Review distance and altitude uncertainties, sextant side/index error, body geometry, separate timestamps and vessel motion.</w:t>
+            <w:tcW w:w="2970" w:type="dxa"/>
+            <w:tcBorders/>
+            <w:vAlign w:val="center"/>
+          </w:tcPr>
+          <w:p>
+            <w:pPr>
+              <w:pStyle w:val="TableContents"/>
+              <w:bidi w:val="0"/>
+              <w:spacing w:before="0" w:after="283"/>
+              <w:rPr/>
+            </w:pPr>
+            <w:r>
+              <w:rPr/>
+              <w:t>Chrony status unavailable</w:t>
+            </w:r>
+          </w:p>
+        </w:tc>
+        <w:tc>
+          <w:tcPr>
+            <w:tcW w:w="6780" w:type="dxa"/>
+            <w:tcBorders/>
+            <w:vAlign w:val="center"/>
+          </w:tcPr>
+          <w:p>
+            <w:pPr>
+              <w:pStyle w:val="TableContents"/>
+              <w:bidi w:val="0"/>
+              <w:spacing w:before="0" w:after="283"/>
+              <w:rPr/>
+            </w:pPr>
+            <w:r>
+              <w:rPr/>
+              <w:t>The computer may use another synchronisation service, chrony may not be installed, or its query interface may be unavailable. UTC display still uses the system clock.</w:t>
             </w:r>
           </w:p>
         </w:tc>
@@ -7800,39 +7831,39 @@
         <w:trPr/>
         <w:tc>
           <w:tcPr>
-            <w:tcW w:w="2969" w:type="dxa"/>
-            <w:tcBorders/>
-            <w:vAlign w:val="center"/>
-          </w:tcPr>
-          <w:p>
-            <w:pPr>
-              <w:pStyle w:val="TableContents"/>
-              <w:bidi w:val="0"/>
-              <w:spacing w:before="0" w:after="283"/>
-              <w:rPr/>
-            </w:pPr>
-            <w:r>
-              <w:rPr/>
-              <w:t>Joint lunar solution has alternates</w:t>
-            </w:r>
-          </w:p>
-        </w:tc>
-        <w:tc>
-          <w:tcPr>
-            <w:tcW w:w="6781" w:type="dxa"/>
-            <w:tcBorders/>
-            <w:vAlign w:val="center"/>
-          </w:tcPr>
-          <w:p>
-            <w:pPr>
-              <w:pStyle w:val="TableContents"/>
-              <w:bidi w:val="0"/>
-              <w:spacing w:before="0" w:after="283"/>
-              <w:rPr/>
-            </w:pPr>
-            <w:r>
-              <w:rPr/>
-              <w:t>Do not choose by RMS alone. Add observations with different bodies/geometry, narrow the time range only from independent evidence, and compare the candidate positions with DR or known hemisphere.</w:t>
+            <w:tcW w:w="2970" w:type="dxa"/>
+            <w:tcBorders/>
+            <w:vAlign w:val="center"/>
+          </w:tcPr>
+          <w:p>
+            <w:pPr>
+              <w:pStyle w:val="TableContents"/>
+              <w:bidi w:val="0"/>
+              <w:spacing w:before="0" w:after="283"/>
+              <w:rPr/>
+            </w:pPr>
+            <w:r>
+              <w:rPr/>
+              <w:t>Lunar solver finds several times</w:t>
+            </w:r>
+          </w:p>
+        </w:tc>
+        <w:tc>
+          <w:tcPr>
+            <w:tcW w:w="6780" w:type="dxa"/>
+            <w:tcBorders/>
+            <w:vAlign w:val="center"/>
+          </w:tcPr>
+          <w:p>
+            <w:pPr>
+              <w:pStyle w:val="TableContents"/>
+              <w:bidi w:val="0"/>
+              <w:spacing w:before="0" w:after="283"/>
+              <w:rPr/>
+            </w:pPr>
+            <w:r>
+              <w:rPr/>
+              <w:t>Narrow the search only when justified; check contact/limbs and altitudes; use DR/hemisphere or another sight to resolve candidates.</w:t>
             </w:r>
           </w:p>
         </w:tc>
@@ -7841,39 +7872,39 @@
         <w:trPr/>
         <w:tc>
           <w:tcPr>
-            <w:tcW w:w="2969" w:type="dxa"/>
-            <w:tcBorders/>
-            <w:vAlign w:val="center"/>
-          </w:tcPr>
-          <w:p>
-            <w:pPr>
-              <w:pStyle w:val="TableContents"/>
-              <w:bidi w:val="0"/>
-              <w:spacing w:before="0" w:after="283"/>
-              <w:rPr/>
-            </w:pPr>
-            <w:r>
-              <w:rPr/>
-              <w:t>Joint lunar residual is flagged</w:t>
-            </w:r>
-          </w:p>
-        </w:tc>
-        <w:tc>
-          <w:tcPr>
-            <w:tcW w:w="6781" w:type="dxa"/>
-            <w:tcBorders/>
-            <w:vAlign w:val="center"/>
-          </w:tcPr>
-          <w:p>
-            <w:pPr>
-              <w:pStyle w:val="TableContents"/>
-              <w:bidi w:val="0"/>
-              <w:spacing w:before="0" w:after="283"/>
-              <w:rPr/>
-            </w:pPr>
-            <w:r>
-              <w:rPr/>
-              <w:t>Check transcription, contact/limb, individual timestamps, uncertainty and conditions. Robust mode retains the reading; investigate before excluding it from a new solution.</w:t>
+            <w:tcW w:w="2970" w:type="dxa"/>
+            <w:tcBorders/>
+            <w:vAlign w:val="center"/>
+          </w:tcPr>
+          <w:p>
+            <w:pPr>
+              <w:pStyle w:val="TableContents"/>
+              <w:bidi w:val="0"/>
+              <w:spacing w:before="0" w:after="283"/>
+              <w:rPr/>
+            </w:pPr>
+            <w:r>
+              <w:rPr/>
+              <w:t>Lunar solution is unstable</w:t>
+            </w:r>
+          </w:p>
+        </w:tc>
+        <w:tc>
+          <w:tcPr>
+            <w:tcW w:w="6780" w:type="dxa"/>
+            <w:tcBorders/>
+            <w:vAlign w:val="center"/>
+          </w:tcPr>
+          <w:p>
+            <w:pPr>
+              <w:pStyle w:val="TableContents"/>
+              <w:bidi w:val="0"/>
+              <w:spacing w:before="0" w:after="283"/>
+              <w:rPr/>
+            </w:pPr>
+            <w:r>
+              <w:rPr/>
+              <w:t>Review distance and altitude uncertainties, sextant side/index error, body geometry, separate timestamps and vessel motion.</w:t>
             </w:r>
           </w:p>
         </w:tc>
@@ -7882,39 +7913,39 @@
         <w:trPr/>
         <w:tc>
           <w:tcPr>
-            <w:tcW w:w="2969" w:type="dxa"/>
-            <w:tcBorders/>
-            <w:vAlign w:val="center"/>
-          </w:tcPr>
-          <w:p>
-            <w:pPr>
-              <w:pStyle w:val="TableContents"/>
-              <w:bidi w:val="0"/>
-              <w:spacing w:before="0" w:after="283"/>
-              <w:rPr/>
-            </w:pPr>
-            <w:r>
-              <w:rPr/>
-              <w:t>Sextant check predicts “unavailable”</w:t>
-            </w:r>
-          </w:p>
-        </w:tc>
-        <w:tc>
-          <w:tcPr>
-            <w:tcW w:w="6781" w:type="dxa"/>
-            <w:tcBorders/>
-            <w:vAlign w:val="center"/>
-          </w:tcPr>
-          <w:p>
-            <w:pPr>
-              <w:pStyle w:val="TableContents"/>
-              <w:bidi w:val="0"/>
-              <w:spacing w:before="0" w:after="283"/>
-              <w:rPr/>
-            </w:pPr>
-            <w:r>
-              <w:rPr/>
-              <w:t>One body is below the usable horizon, the bodies are identical, or the entered UTC/position is wrong. Select another pair/time and check UTC rather than local civil time.</w:t>
+            <w:tcW w:w="2970" w:type="dxa"/>
+            <w:tcBorders/>
+            <w:vAlign w:val="center"/>
+          </w:tcPr>
+          <w:p>
+            <w:pPr>
+              <w:pStyle w:val="TableContents"/>
+              <w:bidi w:val="0"/>
+              <w:spacing w:before="0" w:after="283"/>
+              <w:rPr/>
+            </w:pPr>
+            <w:r>
+              <w:rPr/>
+              <w:t>Joint lunar solution has alternates</w:t>
+            </w:r>
+          </w:p>
+        </w:tc>
+        <w:tc>
+          <w:tcPr>
+            <w:tcW w:w="6780" w:type="dxa"/>
+            <w:tcBorders/>
+            <w:vAlign w:val="center"/>
+          </w:tcPr>
+          <w:p>
+            <w:pPr>
+              <w:pStyle w:val="TableContents"/>
+              <w:bidi w:val="0"/>
+              <w:spacing w:before="0" w:after="283"/>
+              <w:rPr/>
+            </w:pPr>
+            <w:r>
+              <w:rPr/>
+              <w:t>Do not choose by RMS alone. Add observations with different bodies/geometry, narrow the time range only from independent evidence, and compare the candidate positions with DR or known hemisphere.</w:t>
             </w:r>
           </w:p>
         </w:tc>
@@ -7923,39 +7954,39 @@
         <w:trPr/>
         <w:tc>
           <w:tcPr>
-            <w:tcW w:w="2969" w:type="dxa"/>
-            <w:tcBorders/>
-            <w:vAlign w:val="center"/>
-          </w:tcPr>
-          <w:p>
-            <w:pPr>
-              <w:pStyle w:val="TableContents"/>
-              <w:bidi w:val="0"/>
-              <w:spacing w:before="0" w:after="283"/>
-              <w:rPr/>
-            </w:pPr>
-            <w:r>
-              <w:rPr/>
-              <w:t>Correction profile varies unexpectedly</w:t>
-            </w:r>
-          </w:p>
-        </w:tc>
-        <w:tc>
-          <w:tcPr>
-            <w:tcW w:w="6781" w:type="dxa"/>
-            <w:tcBorders/>
-            <w:vAlign w:val="center"/>
-          </w:tcPr>
-          <w:p>
-            <w:pPr>
-              <w:pStyle w:val="TableContents"/>
-              <w:bidi w:val="0"/>
-              <w:spacing w:before="0" w:after="283"/>
-              <w:rPr/>
-            </w:pPr>
-            <w:r>
-              <w:rPr/>
-              <w:t>Repeat the check, use similar-altitude star pairs, keep shades/technique identified, verify mechanical adjustment and compare only within the measured angular range.</w:t>
+            <w:tcW w:w="2970" w:type="dxa"/>
+            <w:tcBorders/>
+            <w:vAlign w:val="center"/>
+          </w:tcPr>
+          <w:p>
+            <w:pPr>
+              <w:pStyle w:val="TableContents"/>
+              <w:bidi w:val="0"/>
+              <w:spacing w:before="0" w:after="283"/>
+              <w:rPr/>
+            </w:pPr>
+            <w:r>
+              <w:rPr/>
+              <w:t>Joint lunar residual is flagged</w:t>
+            </w:r>
+          </w:p>
+        </w:tc>
+        <w:tc>
+          <w:tcPr>
+            <w:tcW w:w="6780" w:type="dxa"/>
+            <w:tcBorders/>
+            <w:vAlign w:val="center"/>
+          </w:tcPr>
+          <w:p>
+            <w:pPr>
+              <w:pStyle w:val="TableContents"/>
+              <w:bidi w:val="0"/>
+              <w:spacing w:before="0" w:after="283"/>
+              <w:rPr/>
+            </w:pPr>
+            <w:r>
+              <w:rPr/>
+              <w:t>Check transcription, contact/limb, individual timestamps, uncertainty and conditions. Robust mode retains the reading; investigate before excluding it from a new solution.</w:t>
             </w:r>
           </w:p>
         </w:tc>
@@ -7964,39 +7995,39 @@
         <w:trPr/>
         <w:tc>
           <w:tcPr>
-            <w:tcW w:w="2969" w:type="dxa"/>
-            <w:tcBorders/>
-            <w:vAlign w:val="center"/>
-          </w:tcPr>
-          <w:p>
-            <w:pPr>
-              <w:pStyle w:val="TableContents"/>
-              <w:bidi w:val="0"/>
-              <w:spacing w:before="0" w:after="283"/>
-              <w:rPr/>
-            </w:pPr>
-            <w:r>
-              <w:rPr/>
-              <w:t>Running fix is poor</w:t>
-            </w:r>
-          </w:p>
-        </w:tc>
-        <w:tc>
-          <w:tcPr>
-            <w:tcW w:w="6781" w:type="dxa"/>
-            <w:tcBorders/>
-            <w:vAlign w:val="center"/>
-          </w:tcPr>
-          <w:p>
-            <w:pPr>
-              <w:pStyle w:val="TableContents"/>
-              <w:bidi w:val="0"/>
-              <w:spacing w:before="0" w:after="283"/>
-              <w:rPr/>
-            </w:pPr>
-            <w:r>
-              <w:rPr/>
-              <w:t>Check the reference epoch, COG/SOG, set and drift, leeway, course alterations and observation geometry.</w:t>
+            <w:tcW w:w="2970" w:type="dxa"/>
+            <w:tcBorders/>
+            <w:vAlign w:val="center"/>
+          </w:tcPr>
+          <w:p>
+            <w:pPr>
+              <w:pStyle w:val="TableContents"/>
+              <w:bidi w:val="0"/>
+              <w:spacing w:before="0" w:after="283"/>
+              <w:rPr/>
+            </w:pPr>
+            <w:r>
+              <w:rPr/>
+              <w:t>Sextant check predicts “unavailable”</w:t>
+            </w:r>
+          </w:p>
+        </w:tc>
+        <w:tc>
+          <w:tcPr>
+            <w:tcW w:w="6780" w:type="dxa"/>
+            <w:tcBorders/>
+            <w:vAlign w:val="center"/>
+          </w:tcPr>
+          <w:p>
+            <w:pPr>
+              <w:pStyle w:val="TableContents"/>
+              <w:bidi w:val="0"/>
+              <w:spacing w:before="0" w:after="283"/>
+              <w:rPr/>
+            </w:pPr>
+            <w:r>
+              <w:rPr/>
+              <w:t>One body is below the usable horizon, the bodies are identical, or the entered UTC/position is wrong. Select another pair/time and check UTC rather than local civil time.</w:t>
             </w:r>
           </w:p>
         </w:tc>
@@ -8005,7 +8036,89 @@
         <w:trPr/>
         <w:tc>
           <w:tcPr>
-            <w:tcW w:w="2969" w:type="dxa"/>
+            <w:tcW w:w="2970" w:type="dxa"/>
+            <w:tcBorders/>
+            <w:vAlign w:val="center"/>
+          </w:tcPr>
+          <w:p>
+            <w:pPr>
+              <w:pStyle w:val="TableContents"/>
+              <w:bidi w:val="0"/>
+              <w:spacing w:before="0" w:after="283"/>
+              <w:rPr/>
+            </w:pPr>
+            <w:r>
+              <w:rPr/>
+              <w:t>Correction profile varies unexpectedly</w:t>
+            </w:r>
+          </w:p>
+        </w:tc>
+        <w:tc>
+          <w:tcPr>
+            <w:tcW w:w="6780" w:type="dxa"/>
+            <w:tcBorders/>
+            <w:vAlign w:val="center"/>
+          </w:tcPr>
+          <w:p>
+            <w:pPr>
+              <w:pStyle w:val="TableContents"/>
+              <w:bidi w:val="0"/>
+              <w:spacing w:before="0" w:after="283"/>
+              <w:rPr/>
+            </w:pPr>
+            <w:r>
+              <w:rPr/>
+              <w:t>Repeat the check, use similar-altitude star pairs, keep shades/technique identified, verify mechanical adjustment and compare only within the measured angular range.</w:t>
+            </w:r>
+          </w:p>
+        </w:tc>
+      </w:tr>
+      <w:tr>
+        <w:trPr/>
+        <w:tc>
+          <w:tcPr>
+            <w:tcW w:w="2970" w:type="dxa"/>
+            <w:tcBorders/>
+            <w:vAlign w:val="center"/>
+          </w:tcPr>
+          <w:p>
+            <w:pPr>
+              <w:pStyle w:val="TableContents"/>
+              <w:bidi w:val="0"/>
+              <w:spacing w:before="0" w:after="283"/>
+              <w:rPr/>
+            </w:pPr>
+            <w:r>
+              <w:rPr/>
+              <w:t>Running fix is poor</w:t>
+            </w:r>
+          </w:p>
+        </w:tc>
+        <w:tc>
+          <w:tcPr>
+            <w:tcW w:w="6780" w:type="dxa"/>
+            <w:tcBorders/>
+            <w:vAlign w:val="center"/>
+          </w:tcPr>
+          <w:p>
+            <w:pPr>
+              <w:pStyle w:val="TableContents"/>
+              <w:bidi w:val="0"/>
+              <w:spacing w:before="0" w:after="283"/>
+              <w:rPr/>
+            </w:pPr>
+            <w:r>
+              <w:rPr/>
+              <w:t>Check the reference epoch, COG/SOG, set and drift, leeway, course alterations and observation geometry.</w:t>
+            </w:r>
+          </w:p>
+        </w:tc>
+      </w:tr>
+      <w:tr>
+        <w:trPr/>
+        <w:tc>
+          <w:tcPr>
+            <w:tcW w:w="2970" w:type="dxa"/>
             <w:tcBorders/>
             <w:vAlign w:val="center"/>
           </w:tcPr>
@@ -8024,7 +8137,7 @@
         </w:tc>
         <w:tc>
           <w:tcPr>
-            <w:tcW w:w="6781" w:type="dxa"/>
+            <w:tcW w:w="6780" w:type="dxa"/>
             <w:tcBorders/>
             <w:vAlign w:val="center"/>
           </w:tcPr>

</xml_diff>

<commit_message>
Correct planner UTC and meridian workflows for 2.8.4
</commit_message>
<xml_diff>
--- a/docs/v2/output/Celestial_Navigation_Manual_v2.docx
+++ b/docs/v2/output/Celestial_Navigation_Manual_v2.docx
@@ -54,9 +54,9 @@
       </w:pPr>
       <w:r>
         <w:rPr/>
-        <w:t>Celestial Navigation plugin 2.8.3</w:t>
+        <w:t>Celestial Navigation plugin 2.8.4</w:t>
         <w:br/>
-        <w:t>Documentation revision 4 September 2026</w:t>
+        <w:t>Documentation revision 7 September 2026</w:t>
       </w:r>
     </w:p>
     <w:p>
@@ -2807,7 +2807,7 @@
         <w:rPr/>
         <w:drawing>
           <wp:inline distT="0" distB="0" distL="0" distR="0">
-            <wp:extent cx="5850000" cy="2992880"/>
+            <wp:extent cx="5850000" cy="2991302"/>
             <wp:effectExtent l="0" t="0" r="0" b="0"/>
             <wp:docPr id="6" name="Image6" title="Two globes comparing the predicted geographic position with correct UTC and a watch twenty minutes slow."/>
             <wp:cNvGraphicFramePr>
@@ -2831,7 +2831,7 @@
                   <pic:spPr bwMode="auto">
                     <a:xfrm>
                       <a:off x="0" y="0"/>
-                      <a:ext cx="5850000" cy="2992880"/>
+                      <a:ext cx="5850000" cy="2991302"/>
                     </a:xfrm>
                     <a:prstGeom prst="rect">
                       <a:avLst/>
@@ -4291,7 +4291,7 @@
       </w:r>
       <w:r>
         <w:rPr/>
-        <w:t xml:space="preserve"> to select a manual offset in half-hour increments. East offsets are positive, west offsets negative. Conversion across midnight changes the UTC date correctly.</w:t>
+        <w:t xml:space="preserve"> to select a manual offset in half-hour increments. East offsets are positive, west offsets negative. Conversion across midnight changes the UTC date correctly. The zone controls are enabled only when ship-zone input or fixed-offset display uses them. A temporarily blank or invalid offset retains the last valid value rather than silently becoming the western limit.</w:t>
       </w:r>
     </w:p>
     <w:p>
@@ -4332,7 +4332,17 @@
       </w:r>
       <w:r>
         <w:rPr/>
-        <w:t xml:space="preserve"> to use the operating system's native date and time controls instead. This changes presentation only, not the instant. Displayed event times may independently be UTC, computer local time, local mean time, or a fixed offset. The calculation itself is normalized to UTC.</w:t>
+        <w:t xml:space="preserve"> to use the operating system's native date and time controls instead. This changes presentation only, not the instant. Displayed event times may independently be UTC, computer local time, local mean time, or a fixed offset. The calculation itself is normalized to UTC. The bold </w:t>
+      </w:r>
+      <w:r>
+        <w:rPr>
+          <w:rStyle w:val="Strong"/>
+        </w:rPr>
+        <w:t>Resolved UTC</w:t>
+      </w:r>
+      <w:r>
+        <w:rPr/>
+        <w:t xml:space="preserve"> line is the authoritative instant shared by every planner tab, independent of entry or display format.</w:t>
       </w:r>
     </w:p>
     <w:p>
@@ -4416,7 +4426,7 @@
       </w:pPr>
       <w:r>
         <w:rPr/>
-        <w:t>Lists astronomical, nautical and civil dawn/dusk, sunrise, sunset, Moonrise, Moonset, local apparent noon and lunar transit when they occur. It reports UTC, selected display time, true bearing and observer position. High-latitude days may legitimately omit an event because the body does not cross the chosen altitude threshold.</w:t>
+        <w:t>Lists astronomical, nautical and civil dawn/dusk, sunrise, sunset, Moonrise, Moonset, local apparent noon and lunar transit when they occur. It reports UTC, selected display time, true bearing and observer position. High-latitude days may legitimately omit an event because the body does not cross the chosen altitude threshold. The schedule always covers the UTC civil day containing the resolved planning instant; local display dates may therefore differ near the date line.</w:t>
       </w:r>
     </w:p>
     <w:p>
@@ -4513,7 +4523,17 @@
       </w:pPr>
       <w:r>
         <w:rPr/>
-        <w:t xml:space="preserve">Provides hourly GHA, SHA, declination, Hc and true Zn for the selected position/time context. </w:t>
+        <w:t xml:space="preserve">Provides hourly body GHA, SHA, declination, GHA Aries, local hour angle of Aries, Hc and true Zn for the selected position/time context. Longitude is signed east-positive, so local hour angle is </w:t>
+      </w:r>
+      <w:r>
+        <w:rPr>
+          <w:rStyle w:val="SourceText"/>
+        </w:rPr>
+        <w:t>GHA + longitude</w:t>
+      </w:r>
+      <w:r>
+        <w:rPr/>
+        <w:t xml:space="preserve">, wrapped to 0–360°. </w:t>
       </w:r>
       <w:r>
         <w:rPr>
@@ -4523,7 +4543,7 @@
       </w:r>
       <w:r>
         <w:rPr/>
-        <w:t xml:space="preserve"> creates a portable table for independent checking or a paper working sheet.</w:t>
+        <w:t xml:space="preserve"> creates the same columns in a portable table for independent checking or a paper working sheet.</w:t>
       </w:r>
     </w:p>
     <w:p>
@@ -5504,7 +5524,7 @@
       </w:pPr>
       <w:r>
         <w:rPr/>
-        <w:t xml:space="preserve">The planner predicts meridian passage. Around that time, observe a series of Sun altitudes and identify the maximum or fit the sequence. Enter the corrected Ho in </w:t>
+        <w:t xml:space="preserve">The planner predicts meridian passage by solving for solar local hour angle zero at the time-dependent observer position; it does not merely sample for the highest displayed altitude. Around that time, observe a series of Sun altitudes and identify the maximum or fit the sequence. Enter the corrected Ho in </w:t>
       </w:r>
       <w:r>
         <w:rPr>
@@ -5546,7 +5566,7 @@
       </w:r>
       <w:r>
         <w:rPr/>
-        <w:t>, use a corrected Ho and the applicable time/position context. The helper applies the ephemeris rather than assuming that Ho equals latitude exactly. Polaris is a northern-hemisphere workflow.</w:t>
+        <w:t>, use a corrected Ho and the applicable time/position context. The helper applies the ephemeris rather than assuming that Ho equals latitude exactly. It displays the predicted Hc and does not offer a solution when Polaris is below the geometric horizon. Polaris is a northern-hemisphere workflow.</w:t>
       </w:r>
     </w:p>
     <w:p>

</xml_diff>

<commit_message>
Improve dialog workflows and preserve window geometry
</commit_message>
<xml_diff>
--- a/docs/v2/output/Celestial_Navigation_Manual_v2.docx
+++ b/docs/v2/output/Celestial_Navigation_Manual_v2.docx
@@ -54,7 +54,7 @@
       </w:pPr>
       <w:r>
         <w:rPr/>
-        <w:t>Celestial Navigation plugin 2.8.4</w:t>
+        <w:t>Celestial Navigation plugin 2.8.5</w:t>
         <w:br/>
         <w:t>Documentation revision 7 September 2026</w:t>
       </w:r>
@@ -3020,7 +3020,7 @@
     </w:p>
     <w:tbl>
       <w:tblPr>
-        <w:tblW w:w="16251" w:type="dxa"/>
+        <w:tblW w:w="16471" w:type="dxa"/>
         <w:jc w:val="start"/>
         <w:tblInd w:w="0" w:type="dxa"/>
         <w:tblLayout w:type="fixed"/>
@@ -3032,14 +3032,14 @@
         </w:tblCellMar>
       </w:tblPr>
       <w:tblGrid>
-        <w:gridCol w:w="2313"/>
+        <w:gridCol w:w="2533"/>
         <w:gridCol w:w="13938"/>
       </w:tblGrid>
       <w:tr>
         <w:trPr/>
         <w:tc>
           <w:tcPr>
-            <w:tcW w:w="2313" w:type="dxa"/>
+            <w:tcW w:w="2533" w:type="dxa"/>
             <w:tcBorders/>
             <w:vAlign w:val="center"/>
           </w:tcPr>
@@ -3086,7 +3086,7 @@
         <w:trPr/>
         <w:tc>
           <w:tcPr>
-            <w:tcW w:w="2313" w:type="dxa"/>
+            <w:tcW w:w="2533" w:type="dxa"/>
             <w:tcBorders/>
             <w:vAlign w:val="center"/>
           </w:tcPr>
@@ -3127,7 +3127,7 @@
         <w:trPr/>
         <w:tc>
           <w:tcPr>
-            <w:tcW w:w="2313" w:type="dxa"/>
+            <w:tcW w:w="2533" w:type="dxa"/>
             <w:tcBorders/>
             <w:vAlign w:val="center"/>
           </w:tcPr>
@@ -3168,7 +3168,7 @@
         <w:trPr/>
         <w:tc>
           <w:tcPr>
-            <w:tcW w:w="2313" w:type="dxa"/>
+            <w:tcW w:w="2533" w:type="dxa"/>
             <w:tcBorders/>
             <w:vAlign w:val="center"/>
           </w:tcPr>
@@ -3209,7 +3209,7 @@
         <w:trPr/>
         <w:tc>
           <w:tcPr>
-            <w:tcW w:w="2313" w:type="dxa"/>
+            <w:tcW w:w="2533" w:type="dxa"/>
             <w:tcBorders/>
             <w:vAlign w:val="center"/>
           </w:tcPr>
@@ -3250,7 +3250,7 @@
         <w:trPr/>
         <w:tc>
           <w:tcPr>
-            <w:tcW w:w="2313" w:type="dxa"/>
+            <w:tcW w:w="2533" w:type="dxa"/>
             <w:tcBorders/>
             <w:vAlign w:val="center"/>
           </w:tcPr>
@@ -3291,7 +3291,7 @@
         <w:trPr/>
         <w:tc>
           <w:tcPr>
-            <w:tcW w:w="2313" w:type="dxa"/>
+            <w:tcW w:w="2533" w:type="dxa"/>
             <w:tcBorders/>
             <w:vAlign w:val="center"/>
           </w:tcPr>
@@ -3332,7 +3332,7 @@
         <w:trPr/>
         <w:tc>
           <w:tcPr>
-            <w:tcW w:w="2313" w:type="dxa"/>
+            <w:tcW w:w="2533" w:type="dxa"/>
             <w:tcBorders/>
             <w:vAlign w:val="center"/>
           </w:tcPr>
@@ -3373,7 +3373,7 @@
         <w:trPr/>
         <w:tc>
           <w:tcPr>
-            <w:tcW w:w="2313" w:type="dxa"/>
+            <w:tcW w:w="2533" w:type="dxa"/>
             <w:tcBorders/>
             <w:vAlign w:val="center"/>
           </w:tcPr>
@@ -3414,7 +3414,7 @@
         <w:trPr/>
         <w:tc>
           <w:tcPr>
-            <w:tcW w:w="2313" w:type="dxa"/>
+            <w:tcW w:w="2533" w:type="dxa"/>
             <w:tcBorders/>
             <w:vAlign w:val="center"/>
           </w:tcPr>
@@ -3455,7 +3455,7 @@
         <w:trPr/>
         <w:tc>
           <w:tcPr>
-            <w:tcW w:w="2313" w:type="dxa"/>
+            <w:tcW w:w="2533" w:type="dxa"/>
             <w:tcBorders/>
             <w:vAlign w:val="center"/>
           </w:tcPr>
@@ -3496,7 +3496,7 @@
         <w:trPr/>
         <w:tc>
           <w:tcPr>
-            <w:tcW w:w="2313" w:type="dxa"/>
+            <w:tcW w:w="2533" w:type="dxa"/>
             <w:tcBorders/>
             <w:vAlign w:val="center"/>
           </w:tcPr>
@@ -3537,20 +3537,20 @@
         <w:trPr/>
         <w:tc>
           <w:tcPr>
-            <w:tcW w:w="2313" w:type="dxa"/>
-            <w:tcBorders/>
-            <w:vAlign w:val="center"/>
-          </w:tcPr>
-          <w:p>
-            <w:pPr>
-              <w:pStyle w:val="TableContents"/>
-              <w:bidi w:val="0"/>
-              <w:spacing w:before="0" w:after="283"/>
-              <w:rPr/>
-            </w:pPr>
-            <w:r>
-              <w:rPr/>
-              <w:t>Hide</w:t>
+            <w:tcW w:w="2533" w:type="dxa"/>
+            <w:tcBorders/>
+            <w:vAlign w:val="center"/>
+          </w:tcPr>
+          <w:p>
+            <w:pPr>
+              <w:pStyle w:val="TableContents"/>
+              <w:bidi w:val="0"/>
+              <w:spacing w:before="0" w:after="283"/>
+              <w:rPr/>
+            </w:pPr>
+            <w:r>
+              <w:rPr/>
+              <w:t>Hide Sights / Show Sights</w:t>
             </w:r>
           </w:p>
         </w:tc>
@@ -3578,7 +3578,7 @@
         <w:trPr/>
         <w:tc>
           <w:tcPr>
-            <w:tcW w:w="2313" w:type="dxa"/>
+            <w:tcW w:w="2533" w:type="dxa"/>
             <w:tcBorders/>
             <w:vAlign w:val="center"/>
           </w:tcPr>
@@ -3619,7 +3619,7 @@
         <w:trPr/>
         <w:tc>
           <w:tcPr>
-            <w:tcW w:w="2313" w:type="dxa"/>
+            <w:tcW w:w="2533" w:type="dxa"/>
             <w:tcBorders/>
             <w:vAlign w:val="center"/>
           </w:tcPr>
@@ -3657,6 +3657,67 @@
         </w:tc>
       </w:tr>
     </w:tbl>
+    <w:p>
+      <w:pPr>
+        <w:pStyle w:val="BodyText"/>
+        <w:bidi w:val="0"/>
+        <w:rPr/>
+      </w:pPr>
+      <w:r>
+        <w:rPr/>
+        <w:t xml:space="preserve">Editors use task-specific actions: </w:t>
+      </w:r>
+      <w:r>
+        <w:rPr>
+          <w:rStyle w:val="Strong"/>
+        </w:rPr>
+        <w:t>Create Sight</w:t>
+      </w:r>
+      <w:r>
+        <w:rPr/>
+        <w:t xml:space="preserve"> or </w:t>
+      </w:r>
+      <w:r>
+        <w:rPr>
+          <w:rStyle w:val="Strong"/>
+        </w:rPr>
+        <w:t>Create Event</w:t>
+      </w:r>
+      <w:r>
+        <w:rPr/>
+        <w:t xml:space="preserve"> for new records, and </w:t>
+      </w:r>
+      <w:r>
+        <w:rPr>
+          <w:rStyle w:val="Strong"/>
+        </w:rPr>
+        <w:t>Save Changes</w:t>
+      </w:r>
+      <w:r>
+        <w:rPr/>
+        <w:t xml:space="preserve"> when editing an existing record. </w:t>
+      </w:r>
+      <w:r>
+        <w:rPr>
+          <w:rStyle w:val="Strong"/>
+        </w:rPr>
+        <w:t>Cancel</w:t>
+      </w:r>
+      <w:r>
+        <w:rPr/>
+        <w:t xml:space="preserve"> discards edits. If an editor contains unsaved changes, closing it with the window close button asks for confirmation before discarding them. Read-only and workbench windows use </w:t>
+      </w:r>
+      <w:r>
+        <w:rPr>
+          <w:rStyle w:val="Strong"/>
+        </w:rPr>
+        <w:t>Close</w:t>
+      </w:r>
+      <w:r>
+        <w:rPr/>
+        <w:t>. Substantial resizable tool windows remember their size and position, and are brought back onto a visible display if the monitor layout later changes.</w:t>
+      </w:r>
+    </w:p>
     <w:p>
       <w:pPr>
         <w:pStyle w:val="BodyText"/>

</xml_diff>

<commit_message>
Release 2.8.5.3: coastal signed-angle fixes and waypoint workflow
</commit_message>
<xml_diff>
--- a/docs/v2/output/Celestial_Navigation_Manual_v2.docx
+++ b/docs/v2/output/Celestial_Navigation_Manual_v2.docx
@@ -54,9 +54,9 @@
       </w:pPr>
       <w:r>
         <w:rPr/>
-        <w:t>Celestial Navigation plugin 2.8.5</w:t>
+        <w:t>Celestial Navigation plugin 2.8.5.3</w:t>
         <w:br/>
-        <w:t>Documentation revision 7 September 2026</w:t>
+        <w:t>Documentation revision 10 September 2026</w:t>
       </w:r>
     </w:p>
     <w:p>
@@ -5883,6 +5883,84 @@
     <w:p>
       <w:pPr>
         <w:pStyle w:val="BodyText"/>
+        <w:bidi w:val="0"/>
+        <w:rPr/>
+      </w:pPr>
+      <w:r>
+        <w:rPr>
+          <w:rStyle w:val="Strong"/>
+        </w:rPr>
+        <w:t>2.8.5.2 precision update:</w:t>
+      </w:r>
+      <w:r>
+        <w:rPr/>
+        <w:t xml:space="preserve"> the DE440 Sun–Moon solver now uses observer-specific light time and annual/diurnal aberration. Bundled IERS Earth-rotation data (DUT1, the difference between UT1 and UTC) already supports high-accuracy offline calculations. Under </w:t>
+      </w:r>
+      <w:r>
+        <w:rPr>
+          <w:rStyle w:val="Strong"/>
+        </w:rPr>
+        <w:t>Lunar Tools → Advanced</w:t>
+      </w:r>
+      <w:r>
+        <w:rPr/>
+        <w:t xml:space="preserve">, </w:t>
+      </w:r>
+      <w:r>
+        <w:rPr>
+          <w:rStyle w:val="Strong"/>
+        </w:rPr>
+        <w:t>Check / download update…</w:t>
+      </w:r>
+      <w:r>
+        <w:rPr/>
+        <w:t xml:space="preserve"> optionally retrieves and validates the latest official table; </w:t>
+      </w:r>
+      <w:r>
+        <w:rPr>
+          <w:rStyle w:val="Strong"/>
+        </w:rPr>
+        <w:t>Import local file…</w:t>
+      </w:r>
+      <w:r>
+        <w:rPr/>
+        <w:t xml:space="preserve"> accepts the same </w:t>
+      </w:r>
+      <w:r>
+        <w:rPr>
+          <w:rStyle w:val="SourceText"/>
+        </w:rPr>
+        <w:t>finals2000A.all</w:t>
+      </w:r>
+      <w:r>
+        <w:rPr/>
+        <w:t xml:space="preserve"> file transferred from another computer. No compiler or restart is required. Startup and solving never download data.</w:t>
+      </w:r>
+    </w:p>
+    <w:p>
+      <w:pPr>
+        <w:pStyle w:val="BodyText"/>
+        <w:bidi w:val="0"/>
+        <w:rPr/>
+      </w:pPr>
+      <w:r>
+        <w:rPr/>
+        <w:t xml:space="preserve">The Advanced tab shows coverage. Each sight uses its own date. Beyond all available data, calculations continue using UT1 = UTC with a reduced-accuracy warning: </w:t>
+      </w:r>
+      <w:r>
+        <w:rPr>
+          <w:rStyle w:val="Strong"/>
+        </w:rPr>
+        <w:t>there is no expiry lockout</w:t>
+      </w:r>
+      <w:r>
+        <w:rPr/>
+        <w:t>. Failed updates retain existing data. The bundled September 2027 endpoint is not a plugin end date. Recorded observations remain unchanged.</w:t>
+      </w:r>
+    </w:p>
+    <w:p>
+      <w:pPr>
+        <w:pStyle w:val="BodyText"/>
         <w:numPr>
           <w:ilvl w:val="0"/>
           <w:numId w:val="13"/>
@@ -6890,6 +6968,51 @@
         <w:rPr/>
       </w:pPr>
       <w:r>
+        <w:rPr>
+          <w:rStyle w:val="Strong"/>
+        </w:rPr>
+        <w:t>2.8.5.3:</w:t>
+      </w:r>
+      <w:r>
+        <w:rPr/>
+        <w:t xml:space="preserve"> sea-horizon mode accepts zero or negative dip-corrected angles, while requiring the index-corrected observed top to be on or above the visible horizon. Waterline mode still requires a positive angle. Choose the baseline actually measured; modes and raw readings are never changed automatically. Both range methods require the target top above the observer; waterline mode also requires positive eye height. Lower targets with potentially ambiguous ranges are not supported.</w:t>
+      </w:r>
+    </w:p>
+    <w:p>
+      <w:pPr>
+        <w:pStyle w:val="BodyText"/>
+        <w:bidi w:val="0"/>
+        <w:rPr/>
+      </w:pPr>
+      <w:r>
+        <w:rPr/>
+        <w:t>The visibility guide estimates the observer's horizon, the target's geographic range, and the waterline-to-top angle at the waterline horizon. These standard-refraction estimates are not a guarantee of visibility or a light's luminous range. A zero dip-corrected angle is not the maximum visibility distance. Use the height of the feature actually sighted (for example, focal height rather than tower height), and express water level relative to the same height datum. Negative water levels are allowed.</w:t>
+      </w:r>
+    </w:p>
+    <w:p>
+      <w:pPr>
+        <w:pStyle w:val="BodyText"/>
+        <w:bidi w:val="0"/>
+        <w:rPr/>
+      </w:pPr>
+      <w:r>
+        <w:rPr>
+          <w:rStyle w:val="Strong"/>
+        </w:rPr>
+        <w:t>Select target waypoint...</w:t>
+      </w:r>
+      <w:r>
+        <w:rPr/>
+        <w:t xml:space="preserve"> copies coordinates from the searchable OpenCPN waypoint/mark list. They remain editable; target height must be checked separately. Cancelling leaves the observation unchanged.</w:t>
+      </w:r>
+    </w:p>
+    <w:p>
+      <w:pPr>
+        <w:pStyle w:val="BodyText"/>
+        <w:bidi w:val="0"/>
+        <w:rPr/>
+      </w:pPr>
+      <w:r>
         <w:rPr/>
         <w:t xml:space="preserve">Observation coordinates and measured angles start blank. Closing the window temporarily retains an unfinished observation; the window says so. Select </w:t>
       </w:r>
@@ -6965,6 +7088,27 @@
       <w:r>
         <w:rPr/>
         <w:t>.</w:t>
+      </w:r>
+    </w:p>
+    <w:p>
+      <w:pPr>
+        <w:pStyle w:val="BodyText"/>
+        <w:bidi w:val="0"/>
+        <w:rPr/>
+      </w:pPr>
+      <w:r>
+        <w:rPr/>
+        <w:t xml:space="preserve">The left, centre and right waypoint buttons fill the corresponding coordinates. Check coordinates when names repeat. Angular uncertainty is entered in </w:t>
+      </w:r>
+      <w:r>
+        <w:rPr>
+          <w:rStyle w:val="Strong"/>
+        </w:rPr>
+        <w:t>arcminutes</w:t>
+      </w:r>
+      <w:r>
+        <w:rPr/>
+        <w:t xml:space="preserve"> (60 arcminutes = 1 degree). The result is formal angular-input uncertainty, not total fix accuracy: it excludes landmark-coordinate errors, misidentification, shared instrument errors and unmodelled motion. Increasing this uncertainty changes the estimate, not the best-fit position. Dedicated radar-bearing/range entry is not implemented; a radar range is not a vertical-angle observation.</w:t>
       </w:r>
     </w:p>
     <w:p>

</xml_diff>

<commit_message>
Fix 2.8.5.3 numerical audit findings and enforce solver convergence
</commit_message>
<xml_diff>
--- a/docs/v2/output/Celestial_Navigation_Manual_v2.docx
+++ b/docs/v2/output/Celestial_Navigation_Manual_v2.docx
@@ -56,7 +56,7 @@
         <w:rPr/>
         <w:t>Celestial Navigation plugin 2.8.5.3</w:t>
         <w:br/>
-        <w:t>Documentation revision 10 September 2026</w:t>
+        <w:t>Documentation revision 11 September 2026</w:t>
       </w:r>
     </w:p>
     <w:p>
@@ -156,6 +156,47 @@
       <w:r>
         <w:rPr/>
         <w:t>The plugin performs its ordinary celestial calculations offline. The eclipse planner also works offline once its separate DE440 data has been imported. Optional LOLA lunar-limb data is not required for navigation or for ordinary eclipse plotting.</w:t>
+      </w:r>
+    </w:p>
+    <w:p>
+      <w:pPr>
+        <w:pStyle w:val="BodyText"/>
+        <w:bidi w:val="0"/>
+        <w:rPr/>
+      </w:pPr>
+      <w:r>
+        <w:rPr>
+          <w:rStyle w:val="Strong"/>
+        </w:rPr>
+        <w:t>11 September numerical-audit update:</w:t>
+      </w:r>
+      <w:r>
+        <w:rPr/>
+        <w:t xml:space="preserve"> corrected UTC handling in generated almanacs (including daylight-saving transitions), ordinary sight azimuths, sextant-calibration longitude geometry, planetary parallax in the planner, and running-fix formal uncertainty. Find Body now uses the sight's effective corrected time, and estimated Hs is checked through the actual forward reduction. Iterative solvers reject unconverged results. Recorded observations are not rewritten. Formal uncertainty is not a guarantee of real-world accuracy.</w:t>
+      </w:r>
+    </w:p>
+    <w:p>
+      <w:pPr>
+        <w:pStyle w:val="BodyText"/>
+        <w:bidi w:val="0"/>
+        <w:ind w:hanging="0" w:start="0" w:end="0"/>
+        <w:rPr>
+          <w:shd w:fill="FFF0F0" w:val="clear"/>
+        </w:rPr>
+      </w:pPr>
+      <w:r>
+        <w:rPr>
+          <w:b/>
+          <w:color w:val="17365D"/>
+          <w:shd w:fill="FFF0F0" w:val="clear"/>
+        </w:rPr>
+        <w:t>Previously generated almanacs:</w:t>
+      </w:r>
+      <w:r>
+        <w:rPr>
+          <w:shd w:fill="FFF0F0" w:val="clear"/>
+        </w:rPr>
+        <w:t xml:space="preserve"> regenerate almanacs produced by earlier builds on computers using a non-UTC timezone. Their UTC-labelled astronomical tables and curves could use an incorrect epoch. Saved sightings themselves are unaffected.</w:t>
       </w:r>
     </w:p>
     <w:p>
@@ -2807,7 +2848,7 @@
         <w:rPr/>
         <w:drawing>
           <wp:inline distT="0" distB="0" distL="0" distR="0">
-            <wp:extent cx="5850000" cy="2991302"/>
+            <wp:extent cx="5850000" cy="2992880"/>
             <wp:effectExtent l="0" t="0" r="0" b="0"/>
             <wp:docPr id="6" name="Image6" title="Two globes comparing the predicted geographic position with correct UTC and a watch twenty minutes slow."/>
             <wp:cNvGraphicFramePr>
@@ -2831,7 +2872,7 @@
                   <pic:spPr bwMode="auto">
                     <a:xfrm>
                       <a:off x="0" y="0"/>
-                      <a:ext cx="5850000" cy="2991302"/>
+                      <a:ext cx="5850000" cy="2992880"/>
                     </a:xfrm>
                     <a:prstGeom prst="rect">
                       <a:avLst/>

</xml_diff>

<commit_message>
Release 2.8.5.4: separate Find position editing from explicit Hs copying
</commit_message>
<xml_diff>
--- a/docs/v2/output/Celestial_Navigation_Manual_v2.docx
+++ b/docs/v2/output/Celestial_Navigation_Manual_v2.docx
@@ -54,7 +54,7 @@
       </w:pPr>
       <w:r>
         <w:rPr/>
-        <w:t>Celestial Navigation plugin 2.8.5.3</w:t>
+        <w:t>Celestial Navigation plugin 2.8.5.4</w:t>
         <w:br/>
         <w:t>Documentation revision 11 September 2026</w:t>
       </w:r>
@@ -211,6 +211,84 @@
       <w:r>
         <w:rPr/>
         <w:t>How to use the manual</w:t>
+      </w:r>
+    </w:p>
+    <w:p>
+      <w:pPr>
+        <w:pStyle w:val="BodyText"/>
+        <w:bidi w:val="0"/>
+        <w:rPr/>
+      </w:pPr>
+      <w:r>
+        <w:rPr>
+          <w:rStyle w:val="Strong"/>
+        </w:rPr>
+        <w:t>2.8.5.4 Find popup:</w:t>
+      </w:r>
+      <w:r>
+        <w:rPr/>
+        <w:t xml:space="preserve"> </w:t>
+      </w:r>
+      <w:r>
+        <w:rPr>
+          <w:rStyle w:val="Strong"/>
+        </w:rPr>
+        <w:t>Close</w:t>
+      </w:r>
+      <w:r>
+        <w:rPr/>
+        <w:t xml:space="preserve"> keeps the edited DR position and returns to Sight Properties without changing the measured altitude. </w:t>
+      </w:r>
+      <w:r>
+        <w:rPr>
+          <w:rStyle w:val="Strong"/>
+        </w:rPr>
+        <w:t>Copy estimated Hs</w:t>
+      </w:r>
+      <w:r>
+        <w:rPr/>
+        <w:t xml:space="preserve"> deliberately replaces the appropriate altitude field and leaves Find open. </w:t>
+      </w:r>
+      <w:r>
+        <w:rPr>
+          <w:rStyle w:val="Strong"/>
+        </w:rPr>
+        <w:t>Reset position</w:t>
+      </w:r>
+      <w:r>
+        <w:rPr/>
+        <w:t xml:space="preserve"> restores the position and live-position setting shown when Find opened; it does not undo an explicit Hs copy. The window close control and Escape behave like Close, and Enter never implicitly copies Hs. Close remains available when no estimate can be calculated. Use </w:t>
+      </w:r>
+      <w:r>
+        <w:rPr>
+          <w:rStyle w:val="Strong"/>
+        </w:rPr>
+        <w:t>Save Changes</w:t>
+      </w:r>
+      <w:r>
+        <w:rPr/>
+        <w:t xml:space="preserve"> in Sight Properties to retain the edit, or its </w:t>
+      </w:r>
+      <w:r>
+        <w:rPr>
+          <w:rStyle w:val="Strong"/>
+        </w:rPr>
+        <w:t>Cancel</w:t>
+      </w:r>
+      <w:r>
+        <w:rPr/>
+        <w:t xml:space="preserve"> to discard it. A computed estimate is not a new observation: do not replace a real sextant reading unintentionally.</w:t>
+      </w:r>
+    </w:p>
+    <w:p>
+      <w:pPr>
+        <w:pStyle w:val="BodyText"/>
+        <w:bidi w:val="0"/>
+        <w:rPr/>
+      </w:pPr>
+      <w:r>
+        <w:rPr/>
+        <w:t>For a bearing sight, Copy estimated Hs is disabled: an altitude must not replace the measured bearing. Position editing and Close still work.</w:t>
       </w:r>
     </w:p>
     <w:p>

</xml_diff>

<commit_message>
Refine Find workflow with independent reset/cancel, observed altitude and clear time toggle
</commit_message>
<xml_diff>
--- a/docs/v2/output/Celestial_Navigation_Manual_v2.docx
+++ b/docs/v2/output/Celestial_Navigation_Manual_v2.docx
@@ -257,7 +257,17 @@
       </w:r>
       <w:r>
         <w:rPr/>
-        <w:t xml:space="preserve"> restores the position and live-position setting shown when Find opened; it does not undo an explicit Hs copy. The window close control and Escape behave like Close, and Enter never implicitly copies Hs. Close remains available when no estimate can be calculated. Use </w:t>
+        <w:t xml:space="preserve"> restores the position and live-position setting shown when Find opened; it does not undo an explicit Hs copy and leaves Find open. </w:t>
+      </w:r>
+      <w:r>
+        <w:rPr>
+          <w:rStyle w:val="Strong"/>
+        </w:rPr>
+        <w:t>Cancel</w:t>
+      </w:r>
+      <w:r>
+        <w:rPr/>
+        <w:t xml:space="preserve"> restores the opening position and closes Find, without undoing an explicitly copied Hs. The window close control and Escape behave like Cancel, and Enter never implicitly copies Hs. Close remains available when no estimate can be calculated. Use </w:t>
       </w:r>
       <w:r>
         <w:rPr>
@@ -289,6 +299,23 @@
       <w:r>
         <w:rPr/>
         <w:t>For a bearing sight, Copy estimated Hs is disabled: an altitude must not replace the measured bearing. Position editing and Close still work.</w:t>
+      </w:r>
+    </w:p>
+    <w:p>
+      <w:pPr>
+        <w:pStyle w:val="BodyText"/>
+        <w:bidi w:val="0"/>
+        <w:rPr/>
+      </w:pPr>
+      <w:r>
+        <w:rPr>
+          <w:rStyle w:val="Strong"/>
+        </w:rPr>
+        <w:t>Altitude (Ho)</w:t>
+      </w:r>
+      <w:r>
+        <w:rPr/>
+        <w:t>, below Hc, shows the reduced observed altitude in the same angle format as Hc. In a lunar Moon/body Find popup it is that body's reduced altitude, not the lunar distance. Copy estimated Hs is beside its estimate; Reset position is beside the coordinate controls. Neither Find Cancel nor Close writes the sights XML file directly.</w:t>
       </w:r>
     </w:p>
     <w:p>
@@ -3899,7 +3926,27 @@
       </w:pPr>
       <w:r>
         <w:rPr/>
-        <w:t>Use the panel to decide how much confidence to place in a captured time and to synchronise a deck watch. Hide the panel when screen space is limited.</w:t>
+        <w:t xml:space="preserve">Use the panel to decide how much confidence to place in a captured time and to synchronise a deck watch. Use </w:t>
+      </w:r>
+      <w:r>
+        <w:rPr>
+          <w:rStyle w:val="Strong"/>
+        </w:rPr>
+        <w:t>Hide Time</w:t>
+      </w:r>
+      <w:r>
+        <w:rPr/>
+        <w:t xml:space="preserve"> and </w:t>
+      </w:r>
+      <w:r>
+        <w:rPr>
+          <w:rStyle w:val="Strong"/>
+        </w:rPr>
+        <w:t>Show Time</w:t>
+      </w:r>
+      <w:r>
+        <w:rPr/>
+        <w:t xml:space="preserve"> to hide or restore the Time integrity panel when screen space is limited; this does not change the solver's time corrections.</w:t>
       </w:r>
     </w:p>
     <w:p>

</xml_diff>